<commit_message>
handle tables efficiently now
</commit_message>
<xml_diff>
--- a/output/Method_Statement_RCC.docx
+++ b/output/Method_Statement_RCC.docx
@@ -59,7 +59,7 @@
         <w:rPr>
           <w:sz w:val="22"/>
         </w:rPr>
-        <w:t>This Method Statement outlines the procedures and quality control measures for the execution of Reinforced Cement Concrete (RCC) works, as defined in Section 5.0 of the project specifications. Its purpose is to ensure all activities related to concrete mix design and production (per §5.1.2.1(i)), the use of specified cement types (per §5.1.2.0), minimum concrete grades (per §5.1.2.1(ii)), water/binder ratio control, curing durations (per §5.1.2.1(vi)), and reinforcement requirements including welding (per §5.1.3.4) conform to the stipulated standards and codes. This ensures the structural integrity and durability of the RCC elements.</w:t>
+        <w:t>This Method Statement details the procedures and controls for Reinforced Cement Concrete (RCC) works, as specified under §5.0. It aims to ensure that all RCC work, including the potential use of Fly ash Blended Cements per IS 1489 (Part I) (§5.1.2.0), strictly adheres to the requirements of IS 456-2000 Code of Practice for Plain and Reinforced Concrete (§5.1.2.1 (i)). The statement covers concrete mix proportion, production, quality assurance measures, and curing to achieve a minimum M-25 grade concrete in all structural elements (§5.1.2.1 (ii)) and to meet specified durability criteria, including enhanced wet curing periods (§5.1.2.1 (vi)).</w:t>
       </w:r>
     </w:p>
     <w:p/>
@@ -76,7 +76,7 @@
         <w:rPr>
           <w:sz w:val="22"/>
         </w:rPr>
-        <w:t>This Method Statement covers Reinforced Cement Concrete (RCC) work, generally described in Section 5.0. The structural elements covered include columns, beams, and slabs, specifically roof slabs (per §5.4.4.2, §5.4.3.3). Construction joints for columns shall be horizontal, positioned 10 to 15 cm below the bottom of the beam running into the column head, with the portion of the column between the stepping off level and the top of the slab concreted with the beam (per §5.4.4.2). Roof slab top surfaces shall be finished even and smooth with a wooden trowel before the concrete begins to set (per §5.4.3.3). Specific project locations for the RCC work are not explicitly stated in the specification. The grade of concrete required for these works is not explicitly stated in the specification.</w:t>
+        <w:t>This method statement covers Reinforced Cement Concrete (RCC) work (per §5.0). The scope includes the construction of columns, beams, column heads, and slabs (per §5.4.4), specifically roof slabs which require an even and smooth wooden trowel finish (per §5.4.3.3). Additionally, RCC work encompasses the construction of piers, abutments, portal frames, pier caps, bearing pedestals, and seismic arresters (per §5.8A listed in §4.4.6), as well as RCC diaphragm walls (per §5.8B listed in §4.4.6). The specific grade of concrete to be used for these works is not explicitly stated in the provided specification excerpts.</w:t>
       </w:r>
     </w:p>
     <w:p/>
@@ -89,11 +89,14 @@
       </w:r>
     </w:p>
     <w:p>
+      <w:pPr>
+        <w:pStyle w:val="ListBullet"/>
+      </w:pPr>
       <w:r>
         <w:rPr>
           <w:sz w:val="22"/>
         </w:rPr>
-        <w:t>**Acronyms and Technical Terms**</w:t>
+        <w:t>Workability** – A characteristic of concrete, measured by determination of compacting factor or slump (per §4.2.2.2, §5.8.5.2).</w:t>
       </w:r>
     </w:p>
     <w:p>
@@ -104,7 +107,7 @@
         <w:rPr>
           <w:sz w:val="22"/>
         </w:rPr>
-        <w:t>RCC WORK** – Reinforced Cement Concrete Work (per §5.9.7.4).</w:t>
+        <w:t>Compacting Factor** – A method for measuring concrete workability, suggested for the ‘very low’ category (per §4.2.2.2).</w:t>
       </w:r>
     </w:p>
     <w:p>
@@ -115,7 +118,7 @@
         <w:rPr>
           <w:sz w:val="22"/>
         </w:rPr>
-        <w:t>RCC** – Not explicitly stated in the specification.</w:t>
+        <w:t>Slump** – A method for measuring concrete workability, restricted to 100 mm maximum for normal methods of placing concrete (per §5.8.5.2).</w:t>
       </w:r>
     </w:p>
     <w:p>
@@ -126,7 +129,7 @@
         <w:rPr>
           <w:sz w:val="22"/>
         </w:rPr>
-        <w:t>IS** – Not explicitly stated in the specification.</w:t>
+        <w:t>PPC** – Fly Ash Blended Cement manufactured conforming to IS 1489 (Part-I) (per §5.1.2.3).</w:t>
       </w:r>
     </w:p>
     <w:p>
@@ -137,7 +140,7 @@
         <w:rPr>
           <w:sz w:val="22"/>
         </w:rPr>
-        <w:t>BIS** – Not explicitly stated in the specification (per §5.1.2.3).</w:t>
+        <w:t>PPCC** – Fly Ash Blended Cements used in Cement Concrete in RCC structures (per §5.1.2.3).</w:t>
       </w:r>
     </w:p>
     <w:p>
@@ -148,7 +151,7 @@
         <w:rPr>
           <w:sz w:val="22"/>
         </w:rPr>
-        <w:t>PPC** – Not explicitly stated in the specification (per §5.1.2.3).</w:t>
+        <w:t>Design Mixes** – Concrete mixes whose strength is controlled by a quality control system as per IS 456, based on random tests of mixes and continuous analysis of cube test results (per §5.9.7.4).</w:t>
       </w:r>
     </w:p>
     <w:p>
@@ -159,7 +162,7 @@
         <w:rPr>
           <w:sz w:val="22"/>
         </w:rPr>
-        <w:t>Liquid Admixtures** – Admixtures introduced into concrete as liquids, categorised as Air Entraining, Water Reducing, Water Reducing Retarders, Retarders, Water Reducing Accelerators, and Accelerators (per §4.1.2.2).</w:t>
+        <w:t>Prescribed Mixes** – Concrete mixes for which periodic and systematic checks ensure cementitious material contents comply with their mix descriptions (per §5.9.7.4).</w:t>
       </w:r>
     </w:p>
     <w:p>
@@ -170,205 +173,7 @@
         <w:rPr>
           <w:sz w:val="22"/>
         </w:rPr>
-        <w:t>Workability** – Concrete characteristic tested upon discharge, with specified acceptance limits for Slump and Compacting Factor (per §5.9.3.2). For 'very low' workability, measurement by compacting factor is appropriate (per §4.2.2.2).</w:t>
-      </w:r>
-    </w:p>
-    <w:p>
-      <w:pPr>
-        <w:pStyle w:val="ListBullet"/>
-      </w:pPr>
-      <w:r>
-        <w:rPr>
-          <w:sz w:val="22"/>
-        </w:rPr>
-        <w:t>Slump** – A test for workability of fresh concrete (per §5.11.4, §5.9.3.2). Acceptance limits are ± 25 mm or 1/3 of the specified value, whichever is less (per §5.9.3.2).</w:t>
-      </w:r>
-    </w:p>
-    <w:p>
-      <w:pPr>
-        <w:pStyle w:val="ListBullet"/>
-      </w:pPr>
-      <w:r>
-        <w:rPr>
-          <w:sz w:val="22"/>
-        </w:rPr>
-        <w:t>Compacting Factor** – A test for workability of fresh concrete (per §5.11.4, §5.9.3.2). Acceptance limits are ± 0.03 (value ≥ 0.90), ± 0.04 (value &lt; 0.90 but &gt; 0.80), or ± 0.05 (value ≤ 0.80) (per §5.9.3.2).</w:t>
-      </w:r>
-    </w:p>
-    <w:p>
-      <w:pPr>
-        <w:pStyle w:val="ListBullet"/>
-      </w:pPr>
-      <w:r>
-        <w:rPr>
-          <w:sz w:val="22"/>
-        </w:rPr>
-        <w:t>Design Mixes** – Mixes controlled for strength per IS 456, based on random tests and continuous analysis of results (per §5.9.7.4).</w:t>
-      </w:r>
-    </w:p>
-    <w:p>
-      <w:pPr>
-        <w:pStyle w:val="ListBullet"/>
-      </w:pPr>
-      <w:r>
-        <w:rPr>
-          <w:sz w:val="22"/>
-        </w:rPr>
-        <w:t>Prescribed Mixes** – Mixes checked for cementitious material contents compliance with mix descriptions (per §5.9.7.4).</w:t>
-      </w:r>
-    </w:p>
-    <w:p>
-      <w:pPr>
-        <w:pStyle w:val="ListBullet"/>
-      </w:pPr>
-      <w:r>
-        <w:rPr>
-          <w:sz w:val="22"/>
-        </w:rPr>
-        <w:t>Flow table test** – May be specified for concrete of very high workability (per §5.9.3.2).</w:t>
-      </w:r>
-    </w:p>
-    <w:p>
-      <w:pPr>
-        <w:pStyle w:val="ListBullet"/>
-      </w:pPr>
-      <w:r>
-        <w:rPr>
-          <w:sz w:val="22"/>
-        </w:rPr>
-        <w:t>Compressive strength testing** – Performed using a machine meeting IS 14858 requirements (per §5.9.7.4).</w:t>
-      </w:r>
-    </w:p>
-    <w:p>
-      <w:pPr>
-        <w:pStyle w:val="ListBullet"/>
-      </w:pPr>
-      <w:r>
-        <w:rPr>
-          <w:sz w:val="22"/>
-        </w:rPr>
-        <w:t>Fresh concrete** – Concrete tested for Slump, Compacting Factor/Workability, Consistency, Weight per cubic metre, cement factor, and air content (per §5.11.4).</w:t>
-      </w:r>
-    </w:p>
-    <w:p>
-      <w:pPr>
-        <w:pStyle w:val="ListBullet"/>
-      </w:pPr>
-      <w:r>
-        <w:rPr>
-          <w:sz w:val="22"/>
-        </w:rPr>
-        <w:t>Compaction** – Not explicitly stated in the specification (per §5.4.3).</w:t>
-      </w:r>
-    </w:p>
-    <w:p>
-      <w:pPr>
-        <w:pStyle w:val="ListBullet"/>
-      </w:pPr>
-      <w:r>
-        <w:rPr>
-          <w:sz w:val="22"/>
-        </w:rPr>
-        <w:t>Concrete** – Not explicitly stated in the specification (per §5.4.0).</w:t>
-      </w:r>
-    </w:p>
-    <w:p>
-      <w:pPr>
-        <w:pStyle w:val="ListBullet"/>
-      </w:pPr>
-      <w:r>
-        <w:rPr>
-          <w:sz w:val="22"/>
-        </w:rPr>
-        <w:t>Water, cement, fine and coarse aggregate** – Not explicitly stated in the specification (per §5.1.1).</w:t>
-      </w:r>
-    </w:p>
-    <w:p>
-      <w:pPr>
-        <w:pStyle w:val="ListBullet"/>
-      </w:pPr>
-      <w:r>
-        <w:rPr>
-          <w:sz w:val="22"/>
-        </w:rPr>
-        <w:t>Testing of Concrete** – Not explicitly stated in the specification (per §4.2.11).</w:t>
-      </w:r>
-    </w:p>
-    <w:p>
-      <w:pPr>
-        <w:pStyle w:val="ListBullet"/>
-      </w:pPr>
-      <w:r>
-        <w:rPr>
-          <w:sz w:val="22"/>
-        </w:rPr>
-        <w:t>Pavement quality concrete** – Not explicitly stated in the specification (per §4.2.2.2).</w:t>
-      </w:r>
-    </w:p>
-    <w:p>
-      <w:pPr>
-        <w:pStyle w:val="ListBullet"/>
-      </w:pPr>
-      <w:r>
-        <w:rPr>
-          <w:sz w:val="22"/>
-        </w:rPr>
-        <w:t>Mix Performance** – Not explicitly stated in the specification (per §5.9.7.4).</w:t>
-      </w:r>
-    </w:p>
-    <w:p>
-      <w:pPr>
-        <w:pStyle w:val="ListBullet"/>
-      </w:pPr>
-      <w:r>
-        <w:rPr>
-          <w:sz w:val="22"/>
-        </w:rPr>
-        <w:t>Consistency, Weight per cubic metre, cement factor, air content** – Not explicitly stated in the specification (per §5.11.4).</w:t>
-      </w:r>
-    </w:p>
-    <w:p>
-      <w:pPr>
-        <w:pStyle w:val="ListBullet"/>
-      </w:pPr>
-      <w:r>
-        <w:rPr>
-          <w:sz w:val="22"/>
-        </w:rPr>
-        <w:t>Spread (flow)** – Not explicitly stated in the specification (per §5.9.3.2).</w:t>
-      </w:r>
-    </w:p>
-    <w:p>
-      <w:pPr>
-        <w:pStyle w:val="ListBullet"/>
-      </w:pPr>
-      <w:r>
-        <w:rPr>
-          <w:sz w:val="22"/>
-        </w:rPr>
-        <w:t>Cementitious material contents** – Not explicitly stated in the specification (per §5.9.7.4).</w:t>
-      </w:r>
-    </w:p>
-    <w:p>
-      <w:pPr>
-        <w:pStyle w:val="ListBullet"/>
-      </w:pPr>
-      <w:r>
-        <w:rPr>
-          <w:sz w:val="22"/>
-        </w:rPr>
-        <w:t>Cube tests** – Not explicitly stated in the specification (per §5.9.7.4).</w:t>
-      </w:r>
-    </w:p>
-    <w:p>
-      <w:pPr>
-        <w:pStyle w:val="ListBullet"/>
-      </w:pPr>
-      <w:r>
-        <w:rPr>
-          <w:sz w:val="22"/>
-        </w:rPr>
-        <w:t>Fly Ash Blended Ce** – Not explicitly stated in the specification (per §5.1.2.3).</w:t>
+        <w:t>Liquid Admixtures** – Admixtures introduced into concrete as liquids, including categories such as Air Entraining, Water Reducing, Water Reducing Retarders, Retarders, Water Reducing Accelerators, and Accelerators (per §4.1.2.2).</w:t>
       </w:r>
     </w:p>
     <w:p/>
@@ -381,14 +186,11 @@
       </w:r>
     </w:p>
     <w:p>
-      <w:pPr>
-        <w:pStyle w:val="ListNumber"/>
-      </w:pPr>
       <w:r>
         <w:rPr>
           <w:sz w:val="22"/>
         </w:rPr>
-        <w:t>IS 9103 (per §4.1.2, §4.1.2.9)</w:t>
+        <w:t>The following codes and documents are explicitly cited in the specifications:</w:t>
       </w:r>
     </w:p>
     <w:p>
@@ -399,7 +201,7 @@
         <w:rPr>
           <w:sz w:val="22"/>
         </w:rPr>
-        <w:t>IS 456- 2000 Code of Practice for Plain and Reinforced Concrete (per §5.1.2.1)</w:t>
+        <w:t>IS 9103 (per §4.1.2, §5.1.2.1)</w:t>
       </w:r>
     </w:p>
     <w:p>
@@ -410,7 +212,29 @@
         <w:rPr>
           <w:sz w:val="22"/>
         </w:rPr>
-        <w:t>BIS (Bureau of Indian Standards) (per §5.1.2.3)</w:t>
+        <w:t>IS 1489 (Part-I) (per §5.1.2.3)</w:t>
+      </w:r>
+    </w:p>
+    <w:p>
+      <w:pPr>
+        <w:pStyle w:val="ListNumber"/>
+      </w:pPr>
+      <w:r>
+        <w:rPr>
+          <w:sz w:val="22"/>
+        </w:rPr>
+        <w:t>IS 456-2000 Code of Practice for Plain and Reinforced Concrete (as amended up to date) (per §5.1.2.1, §5.8.6.2)</w:t>
+      </w:r>
+    </w:p>
+    <w:p>
+      <w:pPr>
+        <w:pStyle w:val="ListNumber"/>
+      </w:pPr>
+      <w:r>
+        <w:rPr>
+          <w:sz w:val="22"/>
+        </w:rPr>
+        <w:t>CPWD SPECIFICATIONS 2019 (per §4.1.2, §5.1.2.1)</w:t>
       </w:r>
     </w:p>
     <w:p/>
@@ -420,6 +244,14 @@
       </w:pPr>
       <w:r>
         <w:t>5. Procedure for Concreting</w:t>
+      </w:r>
+    </w:p>
+    <w:p>
+      <w:r>
+        <w:rPr>
+          <w:sz w:val="22"/>
+        </w:rPr>
+        <w:t>The following procedure outlines the steps for RCC works:</w:t>
       </w:r>
     </w:p>
     <w:p>
@@ -470,7 +302,7 @@
         <w:rPr>
           <w:sz w:val="22"/>
         </w:rPr>
-        <w:t>Concrete mix proportioning shall be carried out by mass, with water and admixture measured by volume (per §5.9.2.1).</w:t>
+        <w:t>**Mix Proportioning:** Due consideration shall be given to the moisture content in aggregates, and the mix shall be designed to restrict the maximum free water cement ratio to less than 0.5 (per §5.8.5.1). The water cement ratio shall be maintained constant at its correct value, with surface water in aggregates considered for quantity adjustments (per §4.2.4.5, Table 4.8).</w:t>
       </w:r>
     </w:p>
     <w:p>
@@ -481,29 +313,62 @@
         <w:rPr>
           <w:sz w:val="22"/>
         </w:rPr>
-        <w:t>Consideration shall be given to the moisture content in aggregates, with the mix designed to restrict the maximum free water-cement ratio to less than 0.5 (per §5.8.5.1).</w:t>
+        <w:t>**Nominal Mix Concrete Proportions (per §4.2.3.2, Table 4.7):**</w:t>
       </w:r>
     </w:p>
     <w:p>
       <w:pPr>
-        <w:pStyle w:val="ListNumber"/>
+        <w:pStyle w:val="ListBullet"/>
       </w:pPr>
       <w:r>
         <w:rPr>
           <w:sz w:val="22"/>
         </w:rPr>
-        <w:t>Design mix concrete is preferred. Nominal mix concrete may be used for M20 or lower grades with specific prior permission from the Engineer-in-Charge, which may involve a higher cement content (per §4.2.3.1).</w:t>
+        <w:t>M5:** Total dry aggregates max 800 kg per 50 kg cement; Fine Aggregate to Coarse Aggregate (FA:CA) generally 1:2 (upper limit 1:1.5, lower limit 1:2.5); Max 60 L water per 50 kg cement.</w:t>
       </w:r>
     </w:p>
     <w:p>
       <w:pPr>
-        <w:pStyle w:val="ListNumber"/>
+        <w:pStyle w:val="ListBullet"/>
       </w:pPr>
       <w:r>
         <w:rPr>
           <w:sz w:val="22"/>
         </w:rPr>
-        <w:t>Ready-mixed concrete shall be supplied having the quality and quantity as agreed with the purchaser and shall generally comply with requirements of IS 456 (per §5.9.2.1).</w:t>
+        <w:t>M7.5:** Total dry aggregates max 625 kg per 50 kg cement; Max 45 L water per 50 kg cement.</w:t>
+      </w:r>
+    </w:p>
+    <w:p>
+      <w:pPr>
+        <w:pStyle w:val="ListBullet"/>
+      </w:pPr>
+      <w:r>
+        <w:rPr>
+          <w:sz w:val="22"/>
+        </w:rPr>
+        <w:t>M10:** Total dry aggregates max 480 kg per 50 kg cement; Max 34 L water per 50 kg cement.</w:t>
+      </w:r>
+    </w:p>
+    <w:p>
+      <w:pPr>
+        <w:pStyle w:val="ListBullet"/>
+      </w:pPr>
+      <w:r>
+        <w:rPr>
+          <w:sz w:val="22"/>
+        </w:rPr>
+        <w:t>M15:** Total dry aggregates max 330 kg per 50 kg cement; Max 32 L water per 50 kg cement.</w:t>
+      </w:r>
+    </w:p>
+    <w:p>
+      <w:pPr>
+        <w:pStyle w:val="ListBullet"/>
+      </w:pPr>
+      <w:r>
+        <w:rPr>
+          <w:sz w:val="22"/>
+        </w:rPr>
+        <w:t>M20:** Total dry aggregates max 250 kg per 50 kg cement; Max 30 L water per 50 kg cement.</w:t>
       </w:r>
     </w:p>
     <w:p>
@@ -522,51 +387,7 @@
         <w:rPr>
           <w:sz w:val="22"/>
         </w:rPr>
-        <w:t>**Mixer Requirements:**</w:t>
-      </w:r>
-    </w:p>
-    <w:p>
-      <w:pPr>
-        <w:pStyle w:val="ListBullet"/>
-      </w:pPr>
-      <w:r>
-        <w:rPr>
-          <w:sz w:val="22"/>
-        </w:rPr>
-        <w:t>Concrete shall be mixed in mechanical batch type concrete mixers conforming to IS 1791, having two blades and fitted with a power loader (lifting hopper type). Half bag mixers and mixers without lifting hoppers shall not be used (per §4.2.5).</w:t>
-      </w:r>
-    </w:p>
-    <w:p>
-      <w:pPr>
-        <w:pStyle w:val="ListBullet"/>
-      </w:pPr>
-      <w:r>
-        <w:rPr>
-          <w:sz w:val="22"/>
-        </w:rPr>
-        <w:t>Mixers shall be maintained in an efficient and clean condition with no appreciable build-up of hardened concrete or cement in the drum, on blades, or on loading/discharge chutes (per §5.9.6.4 (iv)).</w:t>
-      </w:r>
-    </w:p>
-    <w:p>
-      <w:pPr>
-        <w:pStyle w:val="ListBullet"/>
-      </w:pPr>
-      <w:r>
-        <w:rPr>
-          <w:sz w:val="22"/>
-        </w:rPr>
-        <w:t>Prior to loading concrete materials or mixed concrete, any water retained in the mixing drum for washing out purposes shall be completely discharged (per §5.9.6.4 (i)).</w:t>
-      </w:r>
-    </w:p>
-    <w:p>
-      <w:pPr>
-        <w:pStyle w:val="ListBullet"/>
-      </w:pPr>
-      <w:r>
-        <w:rPr>
-          <w:sz w:val="22"/>
-        </w:rPr>
-        <w:t>Mixers shall be tested under normal working conditions in accordance with IS 4643 to ensure uniformity. The percentage variation between quantities (mass in water) of cement, fine aggregate, and coarse aggregate in the two halves of a batch and the average shall not exceed 8% for cement, 6% for fine aggregate, and 5% for coarse aggregate (per §4.2.5.2).</w:t>
+        <w:t>**Equipment:** Concrete shall be mixed in mechanical batch type concrete mixers conforming to IS 1791, having two blades and fitted with a power loader (lifting hopper type). Half bag mixers and mixers without lifting hoppers shall not be used (per §4.2.5).</w:t>
       </w:r>
     </w:p>
     <w:p>
@@ -577,18 +398,7 @@
         <w:rPr>
           <w:sz w:val="22"/>
         </w:rPr>
-        <w:t>**Aggregate Preparation:**</w:t>
-      </w:r>
-    </w:p>
-    <w:p>
-      <w:pPr>
-        <w:pStyle w:val="ListBullet"/>
-      </w:pPr>
-      <w:r>
-        <w:rPr>
-          <w:sz w:val="22"/>
-        </w:rPr>
-        <w:t>Brick aggregate shall be well soaked with water for a minimum period of two hours. Stone aggregate or gravel shall be washed with water to remove dirt, dust, and other foreign materials (per §4.2.5).</w:t>
+        <w:t>**Hand Mixing:** Hand mixing may be done only in exceptional circumstances (e.g., mechanical breakdown, remote areas, power breakdown, very small quantity) with specific prior written permission from the Engineer-in-Charge and subject to adding 10% extra cement. It shall be carried out on a watertight platform until uniform in colour and consistency (per §4.2.5).</w:t>
       </w:r>
     </w:p>
     <w:p>
@@ -599,62 +409,7 @@
         <w:rPr>
           <w:sz w:val="22"/>
         </w:rPr>
-        <w:t>**Mixing Procedure:**</w:t>
-      </w:r>
-    </w:p>
-    <w:p>
-      <w:pPr>
-        <w:pStyle w:val="ListBullet"/>
-      </w:pPr>
-      <w:r>
-        <w:rPr>
-          <w:sz w:val="22"/>
-        </w:rPr>
-        <w:t>Stationary mixers shall not be loaded in excess of the manufacturer’s rated capacity. Mixing time, measured from when all materials (including water) are in the drum, shall not be less than that recommended by the manufacturer (per §5.9.6.4 (ii)).</w:t>
-      </w:r>
-    </w:p>
-    <w:p>
-      <w:pPr>
-        <w:pStyle w:val="ListBullet"/>
-      </w:pPr>
-      <w:r>
-        <w:rPr>
-          <w:sz w:val="22"/>
-        </w:rPr>
-        <w:t>For guidance, the mixing time may be 1.5 to 2 minutes, or 2.5 to 3 minutes for hydrophobic cement (per §4.2.5).</w:t>
-      </w:r>
-    </w:p>
-    <w:p>
-      <w:pPr>
-        <w:pStyle w:val="ListBullet"/>
-      </w:pPr>
-      <w:r>
-        <w:rPr>
-          <w:sz w:val="22"/>
-        </w:rPr>
-        <w:t>Truck mixers shall not be loaded in excess of the manufacturer’s rated capacity. If no data is available, mixing shall continue for not less than 60 revolutions of the truck mixer drum at a rate of not less than 7 revolutions/min. All completely truck-mixed concrete shall be visually inspected for uniformity prior to leaving the plant (per §5.9.6.4 (iii)).</w:t>
-      </w:r>
-    </w:p>
-    <w:p>
-      <w:pPr>
-        <w:pStyle w:val="ListBullet"/>
-      </w:pPr>
-      <w:r>
-        <w:rPr>
-          <w:sz w:val="22"/>
-        </w:rPr>
-        <w:t>When pre-mixed concrete is transported in a truck mixer or agitator, the concrete shall be agitated during transit and remixed at the site for at least 2 minutes to ensure the required uniformity (per §5.9.6.4 (iii)).</w:t>
-      </w:r>
-    </w:p>
-    <w:p>
-      <w:pPr>
-        <w:pStyle w:val="ListBullet"/>
-      </w:pPr>
-      <w:r>
-        <w:rPr>
-          <w:sz w:val="22"/>
-        </w:rPr>
-        <w:t>If water is added to the concrete in a truck mixer, it shall be ensured that the truck mixer water meter is operational and properly calibrated, or water must be measured in a suitable container (per §5.9.6.4 (iii)).</w:t>
+        <w:t>**Aggregate Preparation:** Brick aggregate shall be well soaked with water for a minimum period of two hours. Stone aggregate or gravel shall be washed to remove dirt, dust, and foreign materials (per §4.2.5).</w:t>
       </w:r>
     </w:p>
     <w:p>
@@ -665,18 +420,18 @@
         <w:rPr>
           <w:sz w:val="22"/>
         </w:rPr>
-        <w:t>**Hand Mixing:**</w:t>
+        <w:t>**Mixing Time:** For guidance, mixing time may be 1.5 to 2 minutes; for hydrophobic cement, it may be 2.5 to 3 minutes (per §4.2.5).</w:t>
       </w:r>
     </w:p>
     <w:p>
       <w:pPr>
-        <w:pStyle w:val="ListBullet"/>
+        <w:pStyle w:val="ListNumber"/>
       </w:pPr>
       <w:r>
         <w:rPr>
           <w:sz w:val="22"/>
         </w:rPr>
-        <w:t>Hand mixing may be done only in exceptional circumstances (e.g., mechanical breakdown, remote areas, or very small quantities) with the specific prior written permission of the Engineer-in-Charge. It requires adding 10% extra cement, being carried out on a watertight platform, and ensuring uniform color and consistency (per §4.2.5).</w:t>
+        <w:t>**Mixing Efficiency:** The mixer shall be tested per IS 4643 to ensure concrete uniformity. Percentage variation in quantity (mass in water) between the two halves of a batch and the average of the two halves shall not exceed: Cement 8%, Fine aggregate 6%, Coarse aggregate 5% (per §4.2.5.2).</w:t>
       </w:r>
     </w:p>
     <w:p>
@@ -695,7 +450,7 @@
         <w:rPr>
           <w:sz w:val="22"/>
         </w:rPr>
-        <w:t>Concrete shall be transported from the mixer to the place of laying as rapidly as possible by methods which will prevent the segregation or loss of any of the ingredients and maintain the required workability (per §4.2.5.5).</w:t>
+        <w:t>Concrete shall be compacted into a dense mass immediately after placing (per §5.4.3.1).</w:t>
       </w:r>
     </w:p>
     <w:p>
@@ -706,51 +461,7 @@
         <w:rPr>
           <w:sz w:val="22"/>
         </w:rPr>
-        <w:t>During hot or cold weather, concrete shall be transported in deep containers, or other suitable methods may be adopted to reduce water loss by evaporation in hot weather and heat loss in cold weather (per §4.2.5.5).</w:t>
-      </w:r>
-    </w:p>
-    <w:p>
-      <w:pPr>
-        <w:pStyle w:val="ListNumber"/>
-      </w:pPr>
-      <w:r>
-        <w:rPr>
-          <w:sz w:val="22"/>
-        </w:rPr>
-        <w:t>The time between mixing and placing of concrete shall not exceed 30 minutes to prevent interference with the initial setting process (per §5.4.2.7).</w:t>
-      </w:r>
-    </w:p>
-    <w:p>
-      <w:pPr>
-        <w:pStyle w:val="ListNumber"/>
-      </w:pPr>
-      <w:r>
-        <w:rPr>
-          <w:sz w:val="22"/>
-        </w:rPr>
-        <w:t>Ready-mixed concrete shall be transported in a truck-mixer unless the purchaser agrees to the use of non-agitating vehicles. When non-agitating vehicles are used, the mixed concrete shall be protected from gain or loss of water (per §5.9.2.2).</w:t>
-      </w:r>
-    </w:p>
-    <w:p>
-      <w:pPr>
-        <w:pStyle w:val="ListNumber"/>
-      </w:pPr>
-      <w:r>
-        <w:rPr>
-          <w:sz w:val="22"/>
-        </w:rPr>
-        <w:t>The concrete shall be placed as soon as possible after delivery, as close as is practicable to its final position, to avoid re-handling or moving the concrete horizontally by vibration (per §5.9.2.2).</w:t>
-      </w:r>
-    </w:p>
-    <w:p>
-      <w:pPr>
-        <w:pStyle w:val="ListNumber"/>
-      </w:pPr>
-      <w:r>
-        <w:rPr>
-          <w:sz w:val="22"/>
-        </w:rPr>
-        <w:t>The purchaser should plan arrangements to enable a full load of concrete to be discharged within 30 minutes of arrival on site (per §5.9.2.2).</w:t>
+        <w:t>Specific procedures for transportation and placing are not explicitly stated in the specification.</w:t>
       </w:r>
     </w:p>
     <w:p>
@@ -762,11 +473,47 @@
       </w:r>
     </w:p>
     <w:p>
+      <w:pPr>
+        <w:pStyle w:val="ListNumber"/>
+      </w:pPr>
       <w:r>
         <w:rPr>
           <w:sz w:val="22"/>
         </w:rPr>
-        <w:t>Not explicitly stated in the specification.</w:t>
+        <w:t>**Method:** Concrete shall be compacted into a dense mass immediately after placing by mechanical vibrators designed for continuous operations, complying with IS 2505, IS 2506, IS 2514, and IS 4656 (per §5.4.3.1).</w:t>
+      </w:r>
+    </w:p>
+    <w:p>
+      <w:pPr>
+        <w:pStyle w:val="ListNumber"/>
+      </w:pPr>
+      <w:r>
+        <w:rPr>
+          <w:sz w:val="22"/>
+        </w:rPr>
+        <w:t>**Hand Compaction:** The Engineer-in-Charge may, at their discretion, permit hand compaction with tamping rods for certain items, ensuring concrete is thoroughly compacted and worked around reinforcement, embedded fixtures, and into form corners (per §5.4.3.1).</w:t>
+      </w:r>
+    </w:p>
+    <w:p>
+      <w:pPr>
+        <w:pStyle w:val="ListNumber"/>
+      </w:pPr>
+      <w:r>
+        <w:rPr>
+          <w:sz w:val="22"/>
+        </w:rPr>
+        <w:t>**Layering:** Layers of concrete shall be placed such that the bottom layer does not finally set before the top layer is placed (per §5.4.3.1).</w:t>
+      </w:r>
+    </w:p>
+    <w:p>
+      <w:pPr>
+        <w:pStyle w:val="ListNumber"/>
+      </w:pPr>
+      <w:r>
+        <w:rPr>
+          <w:sz w:val="22"/>
+        </w:rPr>
+        <w:t>**Vibration:** Vibrators shall maintain adequate agitation for de-aeration and effective compaction, commensurate with the supply rate. Vibration shall continue throughout the placing period, with vibrators adjusted so the center of vibrations approximates the center of the mass being compacted (per §5.4.3.1).</w:t>
       </w:r>
     </w:p>
     <w:p>
@@ -794,11 +541,58 @@
       </w:r>
     </w:p>
     <w:p>
+      <w:pPr>
+        <w:pStyle w:val="ListNumber"/>
+      </w:pPr>
       <w:r>
         <w:rPr>
           <w:sz w:val="22"/>
         </w:rPr>
-        <w:t>Not explicitly stated in the specification.</w:t>
+        <w:t>**Purpose:** Curing is the process of preventing loss of moisture from the concrete (per §4.2.10).</w:t>
+      </w:r>
+    </w:p>
+    <w:p>
+      <w:pPr>
+        <w:pStyle w:val="ListNumber"/>
+      </w:pPr>
+      <w:r>
+        <w:rPr>
+          <w:sz w:val="22"/>
+        </w:rPr>
+        <w:t>**Initial Protection:** After concrete has begun to harden (approximately 1 to 2 hours after laying), it shall be protected from quick drying by covering with moist gunny bags, sand, canvass Hessian, or other Engineer-in-Charge approved material (per §5.4.6).</w:t>
+      </w:r>
+    </w:p>
+    <w:p>
+      <w:pPr>
+        <w:pStyle w:val="ListNumber"/>
+      </w:pPr>
+      <w:r>
+        <w:rPr>
+          <w:sz w:val="22"/>
+        </w:rPr>
+        <w:t>**Ponding:** After 24 hours of laying, the surface shall be cured by ponding with water for a minimum period of 7 days from the date of placing for Ordinary Portland Cement (OPC), and at least 10 days where mineral admixtures or blended cements are used (per §5.4.6).</w:t>
+      </w:r>
+    </w:p>
+    <w:p>
+      <w:pPr>
+        <w:pStyle w:val="ListNumber"/>
+      </w:pPr>
+      <w:r>
+        <w:rPr>
+          <w:sz w:val="22"/>
+        </w:rPr>
+        <w:t>**Weather Conditions:** The curing period shall not be less than 10 days for concrete exposed to dry and hot weather conditions (per §5.4.6).</w:t>
+      </w:r>
+    </w:p>
+    <w:p>
+      <w:pPr>
+        <w:pStyle w:val="ListNumber"/>
+      </w:pPr>
+      <w:r>
+        <w:rPr>
+          <w:sz w:val="22"/>
+        </w:rPr>
+        <w:t>**Membrane Curing:** Approved curing compounds may be used in lieu of moist curing with the Engineer-in-Charge's permission. Such compounds shall be applied to all exposed surfaces as soon as possible after the concrete has set. Impermeable membranes, such as polythene sheets, may also be used (per §4.2.10.2).</w:t>
       </w:r>
     </w:p>
     <w:p/>
@@ -818,7 +612,7 @@
         <w:rPr>
           <w:sz w:val="22"/>
         </w:rPr>
-        <w:t>Stationary mixers:** Used for mixing concrete. (§5.9.6.4)</w:t>
+        <w:t>Props**: Provided for multi-stage centering where the height exceeds 3.50 metres (per §5.2.3.4). They also support beam heads (per §5.2.3.3).</w:t>
       </w:r>
     </w:p>
     <w:p>
@@ -829,7 +623,7 @@
         <w:rPr>
           <w:sz w:val="22"/>
         </w:rPr>
-        <w:t>Mechanical batch type concrete mixers (conforming to IS 1791, with two blades and power loader (lifting hopper type)):** Used for mixing concrete. (§4.2.5)</w:t>
+        <w:t>Steel shuttering**: Used for concreting, requiring sufficient stiffness, proper repair, and cleaning (per §5.2.3.3).</w:t>
       </w:r>
     </w:p>
     <w:p>
@@ -840,7 +634,7 @@
         <w:rPr>
           <w:sz w:val="22"/>
         </w:rPr>
-        <w:t>Truck mixers:** Used for partial or complete mixing of concrete, or for transporting agitated concrete. (§5.9.6.4)</w:t>
+        <w:t>12 mm thick water proofing ply**: May be used as shuttering for unavoidable portions and very small works where steel shuttering is not feasible (per §5.2.3.3).</w:t>
       </w:r>
     </w:p>
     <w:p>
@@ -851,7 +645,7 @@
         <w:rPr>
           <w:sz w:val="22"/>
         </w:rPr>
-        <w:t>Agitators:** Used for transporting concrete. (§5.9.6.4)</w:t>
+        <w:t>Rubberized lining of material**: Provided in shuttering joints, if required and approved by the Engineer-in-Charge, to prevent slurry leakage (per §5.2.3.3).</w:t>
       </w:r>
     </w:p>
     <w:p>
@@ -862,7 +656,7 @@
         <w:rPr>
           <w:sz w:val="22"/>
         </w:rPr>
-        <w:t>Truck mixer water meter:** Used for measuring water added to concrete in a truck mixer. (§5.9.6.4)</w:t>
+        <w:t>Runner Joists (RSJ, MS Channel or other suitable sections)**: Used as runners in shuttering (per §5.2.3.3).</w:t>
       </w:r>
     </w:p>
     <w:p>
@@ -873,7 +667,7 @@
         <w:rPr>
           <w:sz w:val="22"/>
         </w:rPr>
-        <w:t>Suitable container:** Used for measuring water when a truck mixer water meter is not available. (§5.9.6.4)</w:t>
+        <w:t>Beam head**: An adopter that fits on prop head plates to provide wider support under beam bottoms (per §5.2.3.3).</w:t>
       </w:r>
     </w:p>
     <w:p>
@@ -884,7 +678,7 @@
         <w:rPr>
           <w:sz w:val="22"/>
         </w:rPr>
-        <w:t>Water tight platform:** Required for hand mixing of concrete. (§4.2.5)</w:t>
+        <w:t>Stationary/Central Mixers**: Used for mixing concrete, not exceeding manufacturer's rated capacity. Mixing time shall be as recommended by the manufacturer (per §5.9.6.4).</w:t>
       </w:r>
     </w:p>
     <w:p>
@@ -895,7 +689,7 @@
         <w:rPr>
           <w:sz w:val="22"/>
         </w:rPr>
-        <w:t>Squeeze pressure pumps:** Used for pumping concrete, consisting of a receiving hopper with re-mixing blades, flexible hose, metal drum, and hydraulically operated metal rollers. (§5.10.2.2)</w:t>
+        <w:t>Continuous mixing plant**: Used to ensure the concrete is of required uniformity (per §5.9.6.4).</w:t>
       </w:r>
     </w:p>
     <w:p>
@@ -906,7 +700,7 @@
         <w:rPr>
           <w:sz w:val="22"/>
         </w:rPr>
-        <w:t>Mechanical vibrators (complying with IS 2505, IS 2506, IS 2514 and IS 4656):** Used for compacting concrete into a dense mass. (§5.4.3.1)</w:t>
+        <w:t>Truck Mixers / Agitators**: Used for partial or complete mixing of concrete and for transportation, not exceeding manufacturer’s rated capacity (per §5.9.6.4).</w:t>
       </w:r>
     </w:p>
     <w:p>
@@ -917,7 +711,29 @@
         <w:rPr>
           <w:sz w:val="22"/>
         </w:rPr>
-        <w:t>Tamping rods:** Used for hand compaction of concrete. (§5.4.3.1)</w:t>
+        <w:t>Truck mixer water meter**: Used to measure water added to concrete in the truck mixer, must be operational and calibrated (per §5.9.6.4).</w:t>
+      </w:r>
+    </w:p>
+    <w:p>
+      <w:pPr>
+        <w:pStyle w:val="ListBullet"/>
+      </w:pPr>
+      <w:r>
+        <w:rPr>
+          <w:sz w:val="22"/>
+        </w:rPr>
+        <w:t>Suitable container**: Used for measuring water if a truck mixer water meter is not available (per §5.9.6.4).</w:t>
+      </w:r>
+    </w:p>
+    <w:p>
+      <w:pPr>
+        <w:pStyle w:val="ListBullet"/>
+      </w:pPr>
+      <w:r>
+        <w:rPr>
+          <w:sz w:val="22"/>
+        </w:rPr>
+        <w:t>Squeeze pressure pumps**: Consist of a receiving hopper with re-mixing blades, a flexible hose, a metal drum maintained under vacuum, and hydraulically operated metal rollers, used for forcing concrete into pipelines (per §5.10.2.2).</w:t>
       </w:r>
     </w:p>
     <w:p/>
@@ -930,14 +746,19 @@
       </w:r>
     </w:p>
     <w:p>
-      <w:pPr>
-        <w:pStyle w:val="ListBullet"/>
-      </w:pPr>
       <w:r>
         <w:rPr>
           <w:sz w:val="22"/>
         </w:rPr>
-        <w:t>Producer (Manufacturer of Concrete)**: Responsible for establishing procedures for diagnosing and correcting faults from complaints (per §5.9.7.6). Exercises forward control including material quality/storage, mix design/modification, and demonstrating calibration procedures for weighing equipment, ensuring operational mixers (per §5.9.7.1). Manages immediate control, including systematic production control, inspection of each load before dispatch/discharge, continuous workability control with corrective action, record-keeping of batched materials, water added, slump, ticket number, and loading time (per §5.9.7.2). Randomly samples and tests concrete for workability, plastic density, temperature, and air content, taking corrective action as needed, and maintaining water-cement ratio (per §5.9.7.2). Maintains records for at least one year covering production/delivery, materials/production control, and quality control test results (per §5.9.9). Finalizes test frequencies for weight, cement factor, and air content in consultation with the Engineer-in-Charge, and complies with additional test requirements (per §5.11.4.4).</w:t>
+        <w:t>The only explicitly mentioned role is the **Producer**, who shall have a procedure in place to enable the diagnosis and correction of faults identified from complaints (per §5.9.7.6).</w:t>
+      </w:r>
+    </w:p>
+    <w:p>
+      <w:r>
+        <w:rPr>
+          <w:sz w:val="22"/>
+        </w:rPr>
+        <w:t>Roles implied by activities, but not explicitly named or assigned specific personnel responsibilities within the provided excerpts, include:</w:t>
       </w:r>
     </w:p>
     <w:p>
@@ -948,7 +769,7 @@
         <w:rPr>
           <w:sz w:val="22"/>
         </w:rPr>
-        <w:t>Engineer-in-Charge**: Consults with the manufacturer to finalize frequency and number of tests for weight, cement factor, and air content. May require further tests on fresh concrete at their discretion (per §5.11.4.4).</w:t>
+        <w:t>Personnel responsible for Testing of Concrete (per §4.2.11, §5.4.9).</w:t>
       </w:r>
     </w:p>
     <w:p>
@@ -959,7 +780,7 @@
         <w:rPr>
           <w:sz w:val="22"/>
         </w:rPr>
-        <w:t>Placement Contractor**: Must comply with all additional testing requirements specified by the Engineer-in-Charge (per §5.11.4.4).</w:t>
+        <w:t>Personnel responsible for Sampling and Testing of Ready-Mixed Concrete (per §5.9.3).</w:t>
       </w:r>
     </w:p>
     <w:p>
@@ -970,7 +791,18 @@
         <w:rPr>
           <w:sz w:val="22"/>
         </w:rPr>
-        <w:t>Batch Plant Laboratory Personnel (Implied)**: Conduct tests in the batch plant laboratory for each batch of concrete produced to determine weight per cubic metre, cement factor, and air content of freshly mixed concrete (per §5.11.4.4).</w:t>
+        <w:t>Personnel responsible for Quality Control, encompassing forward, immediate, and retrospective control (per §5.9.7).</w:t>
+      </w:r>
+    </w:p>
+    <w:p>
+      <w:pPr>
+        <w:pStyle w:val="ListBullet"/>
+      </w:pPr>
+      <w:r>
+        <w:rPr>
+          <w:sz w:val="22"/>
+        </w:rPr>
+        <w:t>Personnel involved in the diagnosis and correction of faults as part of the complaint procedure (per §5.9.7.6).</w:t>
       </w:r>
     </w:p>
     <w:p/>
@@ -987,7 +819,7 @@
         <w:rPr>
           <w:sz w:val="22"/>
         </w:rPr>
-        <w:t>Quality control for RCC works mandates cube tests for compressive strength per §5.4.9.1. Sampling for cube crushing strength (IS 456, IS 516) occurs at the central batch plant and placement location. Field test specimens from placement are the criterion for concrete strength; batch plant samples are guidelines, referenced by the Engineer-in-Charge only in case of doubtful results (§5.11.5(i)b). For truck mix, samples omit the first and last 15% of the load at discharge (§5.11.5(i)c).</w:t>
+        <w:t>Quality control mandates cube tests for concrete compressive strength per IS 456 and IS 516 (§5.4.9.1, §5.11.5(i)). Fresh concrete samples are taken from the central batch plant (guideline tests) and placement location (field tests), with field test results serving as the sole criterion for strength (§5.11.5(a), (b)). For truck/shrink mix, guideline samples are collected at discharge, omitting the first and last 15% of the load (§5.11.5(c)).</w:t>
       </w:r>
     </w:p>
     <w:p>
@@ -995,7 +827,7 @@
         <w:rPr>
           <w:sz w:val="22"/>
         </w:rPr>
-        <w:t>Sampling frequency for 28-day and 7-day tests (Table 5.8) is: 1 sample for less than 5 cum, 2 for 6-15 cum, 3 for 31-50 cum, and 4 plus one additional for each 50 cum or part thereof for 51 cum and above. Each sample yields a minimum of 3 specimen cubes (§5.11.5(i)d, f). Preliminary tests for design mix finalization, conducted at 7 and 28 days (six specimens each), must have average results not less than Table 5.5 values (§5.11.5(i)g).</w:t>
+        <w:t>Sampling frequency for 28-day crushing strength tests, for both field and guideline specimens, is as given in Table 5.8. Each sample must yield a minimum of 3 cubes per IS 516 (§5.11.5(d)). Identical frequencies apply to 7-day early strength tests (§5.11.5(f)). Preliminary design mix tests mandate six 7-day and six 28-day specimens (§5.11.5(g)).</w:t>
       </w:r>
     </w:p>
     <w:p>
@@ -1003,7 +835,7 @@
         <w:rPr>
           <w:sz w:val="22"/>
         </w:rPr>
-        <w:t>Acceptance criteria require 28-day field specimen results to meet Table 5.6 values (§5.11.5(i)e). 7-day strengths conforming to Table 5.5 are guideline values only and not deemed conforming to specifications (§5.11.5(i)f).</w:t>
+        <w:t>Acceptance for 28-day field specimen crushing strength requires results not less than values given in Table 5.6 (§5.11.5(e)). 7-day strengths are for projection only and do not confirm specification compliance (§5.11.5(f)).</w:t>
       </w:r>
     </w:p>
     <w:p>
@@ -1011,7 +843,7 @@
         <w:rPr>
           <w:sz w:val="22"/>
         </w:rPr>
-        <w:t>If 28-day strengths are short or doubtful, the Engineer-in-Charge may order non-destructive tests: Rebound hammer, Windsor Penetration Probe, Pulse velocity, Core test (IS 516, IS 1199), or Load test (§5.11.5(ii)a, c, d). Interpretation of NDT results rests with the Engineer-in-Charge (§5.11.5(ii)b).</w:t>
+        <w:t>Should 28-day values fall short, or concrete placement be doubtful, the Engineer-in-Charge may order non-destructive tests (e.g., Rebound hammer, Core test, Load test) (§5.11.5(ii)(a)). Core tests follow IS 516, with samples per IS:1199 from Engineer-in-Charge identified locations (§5.11.5(ii)(c)).</w:t>
       </w:r>
     </w:p>
     <w:p>
@@ -1019,7 +851,7 @@
         <w:rPr>
           <w:sz w:val="22"/>
         </w:rPr>
-        <w:t>All test specimens must be properly labeled (§5.11.5(i)i). Field laboratory tests require qualified technicians and the presence of the Engineer-in-Charge's authorized representative; reports must be jointly signed (§5.11.5(ii)f). The Engineer-in-Charge determines test locations, and the concrete manufacturer/placement contractor is responsible for all test costs, equipment, and setting up a staffed laboratory (§5.11.5(ii)e, g, h).</w:t>
+        <w:t>All tests are to be conducted by qualified contractor/manufacturer technicians, witnessed by the Engineer-in-Charge’s authorized representative, with reports jointly signed (§5.11.5(ii)(f)). The contractor/manufacturer must establish a fully equipped and staffed field laboratory at their expense (§5.11.5(ii)(h)) and bear all testing costs (§5.11.5(ii)(e)). Specimens must be properly labeled with date, grade, exact placement location, and purchaser's order number (§5.11.5(i)).</w:t>
       </w:r>
     </w:p>
     <w:p/>
@@ -1036,7 +868,7 @@
         <w:rPr>
           <w:sz w:val="22"/>
         </w:rPr>
-        <w:t>Not explicitly stated in the specification. The provided excerpts detail protective measures for the concrete itself, such as protection from rain (per §4.2.10.3) and sulphate attack (per §4.2.14.1.3), but do not explicitly state measures pertaining to worker health, worker safety, or broader environmental protection from construction activities.</w:t>
+        <w:t>Health, Safety, and Environmental (HSE) measures are not explicitly stated in the provided specification excerpts. The documents classify environmental exposure conditions for the concrete's working life (per §4.2.14.1.1) and specify nominal concrete cover based on these exposure levels (per §5.3.3.5 and §5.3.5), but do not detail any procedures, requirements, or precautions for worker safety, health protection, or environmental management during RCC works.</w:t>
       </w:r>
     </w:p>
     <w:p/>
@@ -1053,7 +885,7 @@
         <w:rPr>
           <w:sz w:val="22"/>
         </w:rPr>
-        <w:t>Materials and works shall conform to reference specifications and applicable codes (§5.12.1.2). Concrete mix, specified by constituent materials for required performance, demands essential mix proportion assessment for compliance (§5.9.4.3). A competent person reviews and formally records mix design specifications/orders (§5.9.8). Material substitutions or proportion alterations require additional quality tests unless permitted (§4.2.4.6). Admixtures conform to IS 9103 and are tested/approved by the Engineer-in-Charge (§4.1.2, §4.1.2.9).</w:t>
+        <w:t>Materials and works shall conform to the latest edition of reference specifications, applicable codes, and requirements of local authorities (per §5.12.1.2). Admixtures must be tested per IS 9103 and approved by the Engineer-in-Charge (per §4.1.2.9); for M30 &amp; above, PCE based and Viscosity Modifiers are specified or as per design mix (per §5.8.6.2).</w:t>
       </w:r>
     </w:p>
     <w:p>
@@ -1061,7 +893,7 @@
         <w:rPr>
           <w:sz w:val="22"/>
         </w:rPr>
-        <w:t>Extreme weather concreting follows IS 7861 (Part–I)-1975 and (Part II)-1981 respectively (§4.2.9.1). Concreting below 4.5ºC is prohibited; placed concrete needs frost protection, with frost-damaged concrete removed/redone (§4.2.9.1, §5.4.2.5). Wet concrete temperature must not exceed 38ºC in hot weather (§4.2.9.1, §5.4.2.6). Transportation prevents segregation/loss of ingredients, maintains workability, and reduces water/heat loss in extreme weather (§4.2.5.5).</w:t>
+        <w:t>Concreting in extreme weather shall follow IS 7861 (Part–I)-1975 (hot) and IS 7861 (Part II)-1981 (cold) (per §4.2.9.1). Concreting is prohibited below 4.5ºC and placed concrete must be protected against frost (per §4.2.9.1, §5.4.2.5). Wet concrete temperature shall not exceed 38ºC during hot weather (per §4.2.9.1, §5.4.2.6). No concrete shall be laid within half an hour of closing time, unless permitted by the Engineer-in-Charge (per §5.4.2.6).</w:t>
       </w:r>
     </w:p>
     <w:p>
@@ -1069,7 +901,7 @@
         <w:rPr>
           <w:sz w:val="22"/>
         </w:rPr>
-        <w:t>Concrete is liable for rejection if porous, honey-combed, placing interrupted without proper joint, reinforcement displaced, or construction tolerances unmet (§5.8.3.6). Defective hardened concrete may be accepted following Engineer-in-Charge approved remedial measures (§5.8.3.6). Non-compliant concrete requires structural adequacy investigation and consequential action (§5.8.3.4).</w:t>
+        <w:t>Concrete is liable to be rejected if porous, honey-combed, placing interrupted without a proper joint, or reinforcement/construction tolerances are not met (per §5.8.3.6). Hardened concrete may be accepted after suitable remedial measures to the Engineer-in-Charge's satisfaction (per §5.8.3.6). Frost-damaged concrete shall be removed and redone (per §5.4.2.5). Non-compliant concrete requires investigation of structural adequacy and consequential action (per §5.8.3.4).</w:t>
       </w:r>
     </w:p>
     <w:p/>

</xml_diff>

<commit_message>
evaluation metrics increased by 6-7% for each block
</commit_message>
<xml_diff>
--- a/output/Method_Statement_RCC.docx
+++ b/output/Method_Statement_RCC.docx
@@ -33,7 +33,7 @@
         <w:br/>
       </w:r>
       <w:r>
-        <w:t>Date: 28 April 2026</w:t>
+        <w:t>Date: 29 April 2026</w:t>
         <w:br/>
       </w:r>
       <w:r>
@@ -59,7 +59,7 @@
         <w:rPr>
           <w:sz w:val="22"/>
         </w:rPr>
-        <w:t>This Method Statement details the procedures and controls for Reinforced Cement Concrete (RCC) works, as specified under §5.0. It aims to ensure that all RCC work, including the potential use of Fly ash Blended Cements per IS 1489 (Part I) (§5.1.2.0), strictly adheres to the requirements of IS 456-2000 Code of Practice for Plain and Reinforced Concrete (§5.1.2.1 (i)). The statement covers concrete mix proportion, production, quality assurance measures, and curing to achieve a minimum M-25 grade concrete in all structural elements (§5.1.2.1 (ii)) and to meet specified durability criteria, including enhanced wet curing periods (§5.1.2.1 (vi)).</w:t>
+        <w:t>This Method Statement defines the procedures for executing Reinforced Cement Concrete (RCC) works, ensuring adherence to the project specifications and relevant codes. It covers the requirements for concrete mix proportion, production, and quality assurance for general structural elements, mandating a minimum M-25 grade concrete per §5.1.2.1. Furthermore, it details the specific manufacturing and installation processes for precast reinforced concrete door and window frames, which utilize M-40 grade concrete and particular reinforcement as outlined in §5.6A, thereby ensuring the quality and durability of all RCC components.</w:t>
       </w:r>
     </w:p>
     <w:p/>
@@ -76,7 +76,15 @@
         <w:rPr>
           <w:sz w:val="22"/>
         </w:rPr>
-        <w:t>This method statement covers Reinforced Cement Concrete (RCC) work (per §5.0). The scope includes the construction of columns, beams, column heads, and slabs (per §5.4.4), specifically roof slabs which require an even and smooth wooden trowel finish (per §5.4.3.3). Additionally, RCC work encompasses the construction of piers, abutments, portal frames, pier caps, bearing pedestals, and seismic arresters (per §5.8A listed in §4.4.6), as well as RCC diaphragm walls (per §5.8B listed in §4.4.6). The specific grade of concrete to be used for these works is not explicitly stated in the provided specification excerpts.</w:t>
+        <w:t>This Method Statement primarily covers Reinforced Cement Concrete (RCC) work as defined under Sub Head 5.0, specifically focusing on Factory Made Precast Reinforced Concrete Door and Window Frames (§5.6A.1.1). These frames shall be manufactured from M 40 grade reinforced cement concrete (§5.6A.1.1, §5.6A.1.3, §5.6A.2.1.3).</w:t>
+      </w:r>
+    </w:p>
+    <w:p>
+      <w:r>
+        <w:rPr>
+          <w:sz w:val="22"/>
+        </w:rPr>
+        <w:t>The scope also includes associated components such as Cement Concrete Blocks of nominal mix 1:3:6 for embedding holdfasts (§5.6A.1.5), High Strength Polymer Blocks for securing hinges and other hardware (§5.6A.1.6, §5.6A.4), Mild Steel Galvanised Sleeves &amp; Bolts (§5.6A.1.7, §5.6A.4), and Hinges (§5.6A.1.8, §5.6A.3). The work encompasses the entire process from manufacture and material compliance to finishing and fixing of these precast units in plumb and plane within the structure (§5.6.7, §5.6A.6).</w:t>
       </w:r>
     </w:p>
     <w:p/>
@@ -89,14 +97,11 @@
       </w:r>
     </w:p>
     <w:p>
-      <w:pPr>
-        <w:pStyle w:val="ListBullet"/>
-      </w:pPr>
       <w:r>
         <w:rPr>
           <w:sz w:val="22"/>
         </w:rPr>
-        <w:t>Workability** – A characteristic of concrete, measured by determination of compacting factor or slump (per §4.2.2.2, §5.8.5.2).</w:t>
+        <w:t>**Acronyms and Technical Terms:**</w:t>
       </w:r>
     </w:p>
     <w:p>
@@ -107,7 +112,7 @@
         <w:rPr>
           <w:sz w:val="22"/>
         </w:rPr>
-        <w:t>Compacting Factor** – A method for measuring concrete workability, suggested for the ‘very low’ category (per §4.2.2.2).</w:t>
+        <w:t>PPC** – Portland Pozzolana Cement manufactured conforming to IS 1489 (Part-I), treated at par with OPC for design mix concrete in RCC for structural use (per §5.1.2.3).</w:t>
       </w:r>
     </w:p>
     <w:p>
@@ -118,7 +123,7 @@
         <w:rPr>
           <w:sz w:val="22"/>
         </w:rPr>
-        <w:t>Slump** – A method for measuring concrete workability, restricted to 100 mm maximum for normal methods of placing concrete (per §5.8.5.2).</w:t>
+        <w:t>RCC** – Reinforced Cement Concrete (per §5.1.2.3).</w:t>
       </w:r>
     </w:p>
     <w:p>
@@ -129,40 +134,7 @@
         <w:rPr>
           <w:sz w:val="22"/>
         </w:rPr>
-        <w:t>PPC** – Fly Ash Blended Cement manufactured conforming to IS 1489 (Part-I) (per §5.1.2.3).</w:t>
-      </w:r>
-    </w:p>
-    <w:p>
-      <w:pPr>
-        <w:pStyle w:val="ListBullet"/>
-      </w:pPr>
-      <w:r>
-        <w:rPr>
-          <w:sz w:val="22"/>
-        </w:rPr>
-        <w:t>PPCC** – Fly Ash Blended Cements used in Cement Concrete in RCC structures (per §5.1.2.3).</w:t>
-      </w:r>
-    </w:p>
-    <w:p>
-      <w:pPr>
-        <w:pStyle w:val="ListBullet"/>
-      </w:pPr>
-      <w:r>
-        <w:rPr>
-          <w:sz w:val="22"/>
-        </w:rPr>
-        <w:t>Design Mixes** – Concrete mixes whose strength is controlled by a quality control system as per IS 456, based on random tests of mixes and continuous analysis of cube test results (per §5.9.7.4).</w:t>
-      </w:r>
-    </w:p>
-    <w:p>
-      <w:pPr>
-        <w:pStyle w:val="ListBullet"/>
-      </w:pPr>
-      <w:r>
-        <w:rPr>
-          <w:sz w:val="22"/>
-        </w:rPr>
-        <w:t>Prescribed Mixes** – Concrete mixes for which periodic and systematic checks ensure cementitious material contents comply with their mix descriptions (per §5.9.7.4).</w:t>
+        <w:t>Compacting Factor** – A measurement of workability, suggested for 'very low' workability concrete with a value of 0.75 to 0.80 (per §4.2.2.2).</w:t>
       </w:r>
     </w:p>
     <w:p>
@@ -176,6 +148,72 @@
         <w:t>Liquid Admixtures** – Admixtures introduced into concrete as liquids, including categories such as Air Entraining, Water Reducing, Water Reducing Retarders, Retarders, Water Reducing Accelerators, and Accelerators (per §4.1.2.2).</w:t>
       </w:r>
     </w:p>
+    <w:p>
+      <w:pPr>
+        <w:pStyle w:val="ListBullet"/>
+      </w:pPr>
+      <w:r>
+        <w:rPr>
+          <w:sz w:val="22"/>
+        </w:rPr>
+        <w:t>Slump** – Not explicitly defined in the specification.</w:t>
+      </w:r>
+    </w:p>
+    <w:p>
+      <w:pPr>
+        <w:pStyle w:val="ListBullet"/>
+      </w:pPr>
+      <w:r>
+        <w:rPr>
+          <w:sz w:val="22"/>
+        </w:rPr>
+        <w:t>Workability** – Not explicitly defined in the specification.</w:t>
+      </w:r>
+    </w:p>
+    <w:p>
+      <w:pPr>
+        <w:pStyle w:val="ListBullet"/>
+      </w:pPr>
+      <w:r>
+        <w:rPr>
+          <w:sz w:val="22"/>
+        </w:rPr>
+        <w:t>Consistency** – Not explicitly defined in the specification.</w:t>
+      </w:r>
+    </w:p>
+    <w:p>
+      <w:pPr>
+        <w:pStyle w:val="ListBullet"/>
+      </w:pPr>
+      <w:r>
+        <w:rPr>
+          <w:sz w:val="22"/>
+        </w:rPr>
+        <w:t>Cement factor** – Not explicitly defined in the specification.</w:t>
+      </w:r>
+    </w:p>
+    <w:p>
+      <w:pPr>
+        <w:pStyle w:val="ListBullet"/>
+      </w:pPr>
+      <w:r>
+        <w:rPr>
+          <w:sz w:val="22"/>
+        </w:rPr>
+        <w:t>BIS** – Not explicitly defined in the specification.</w:t>
+      </w:r>
+    </w:p>
+    <w:p>
+      <w:pPr>
+        <w:pStyle w:val="ListBullet"/>
+      </w:pPr>
+      <w:r>
+        <w:rPr>
+          <w:sz w:val="22"/>
+        </w:rPr>
+        <w:t>OPC** – Not explicitly defined in the specification.</w:t>
+      </w:r>
+    </w:p>
     <w:p/>
     <w:p>
       <w:pPr>
@@ -186,11 +224,14 @@
       </w:r>
     </w:p>
     <w:p>
+      <w:pPr>
+        <w:pStyle w:val="ListNumber"/>
+      </w:pPr>
       <w:r>
         <w:rPr>
           <w:sz w:val="22"/>
         </w:rPr>
-        <w:t>The following codes and documents are explicitly cited in the specifications:</w:t>
+        <w:t>IS 456- 2000 Code of Practice for Plain and Reinforced Concrete (as amended up to date) (per §5.1.2.1 (i), §4.2.1 Note 2, §5.8.6.2)</w:t>
       </w:r>
     </w:p>
     <w:p>
@@ -201,7 +242,7 @@
         <w:rPr>
           <w:sz w:val="22"/>
         </w:rPr>
-        <w:t>IS 9103 (per §4.1.2, §5.1.2.1)</w:t>
+        <w:t>IS 9103 (for chloride free chemical admixtures) (per §5.1.2.1 (iv), §4.1.2)</w:t>
       </w:r>
     </w:p>
     <w:p>
@@ -212,29 +253,7 @@
         <w:rPr>
           <w:sz w:val="22"/>
         </w:rPr>
-        <w:t>IS 1489 (Part-I) (per §5.1.2.3)</w:t>
-      </w:r>
-    </w:p>
-    <w:p>
-      <w:pPr>
-        <w:pStyle w:val="ListNumber"/>
-      </w:pPr>
-      <w:r>
-        <w:rPr>
-          <w:sz w:val="22"/>
-        </w:rPr>
-        <w:t>IS 456-2000 Code of Practice for Plain and Reinforced Concrete (as amended up to date) (per §5.1.2.1, §5.8.6.2)</w:t>
-      </w:r>
-    </w:p>
-    <w:p>
-      <w:pPr>
-        <w:pStyle w:val="ListNumber"/>
-      </w:pPr>
-      <w:r>
-        <w:rPr>
-          <w:sz w:val="22"/>
-        </w:rPr>
-        <w:t>CPWD SPECIFICATIONS 2019 (per §4.1.2, §5.1.2.1)</w:t>
+        <w:t>IS 1489 (Part-I) (for PPC) (per §5.1.2.3 (i))</w:t>
       </w:r>
     </w:p>
     <w:p/>
@@ -244,14 +263,6 @@
       </w:pPr>
       <w:r>
         <w:t>5. Procedure for Concreting</w:t>
-      </w:r>
-    </w:p>
-    <w:p>
-      <w:r>
-        <w:rPr>
-          <w:sz w:val="22"/>
-        </w:rPr>
-        <w:t>The following procedure outlines the steps for RCC works:</w:t>
       </w:r>
     </w:p>
     <w:p>
@@ -283,7 +294,7 @@
         <w:rPr>
           <w:sz w:val="22"/>
         </w:rPr>
-        <w:t>Not explicitly stated in the specification.</w:t>
+        <w:t>Concrete shall be thoroughly compacted and completely worked around the reinforcement, embedded fixtures, and into corners of the form (§9). Specific details on reinforcement placement, tying, or cover are not explicitly stated in the specification.</w:t>
       </w:r>
     </w:p>
     <w:p>
@@ -302,7 +313,7 @@
         <w:rPr>
           <w:sz w:val="22"/>
         </w:rPr>
-        <w:t>**Mix Proportioning:** Due consideration shall be given to the moisture content in aggregates, and the mix shall be designed to restrict the maximum free water cement ratio to less than 0.5 (per §5.8.5.1). The water cement ratio shall be maintained constant at its correct value, with surface water in aggregates considered for quantity adjustments (per §4.2.4.5, Table 4.8).</w:t>
+        <w:t>Concrete mix proportioning shall preferably be 'Design mix concrete' (§2). For grades M20 or lower, 'Nominal mix concrete' may be used with Engineer-in-Charge's permission, which may involve higher cement content (§2).</w:t>
       </w:r>
     </w:p>
     <w:p>
@@ -313,62 +324,51 @@
         <w:rPr>
           <w:sz w:val="22"/>
         </w:rPr>
-        <w:t>**Nominal Mix Concrete Proportions (per §4.2.3.2, Table 4.7):**</w:t>
+        <w:t>Determination of cement, aggregate, and water proportions shall be based on the design of the mix (§8).</w:t>
       </w:r>
     </w:p>
     <w:p>
       <w:pPr>
-        <w:pStyle w:val="ListBullet"/>
+        <w:pStyle w:val="ListNumber"/>
       </w:pPr>
       <w:r>
         <w:rPr>
           <w:sz w:val="22"/>
         </w:rPr>
-        <w:t>M5:** Total dry aggregates max 800 kg per 50 kg cement; Fine Aggregate to Coarse Aggregate (FA:CA) generally 1:2 (upper limit 1:1.5, lower limit 1:2.5); Max 60 L water per 50 kg cement.</w:t>
+        <w:t>Proportioning shall be carried out by mass for all materials, except water and admixtures which may be measured by volume (§5.9.2.1).</w:t>
       </w:r>
     </w:p>
     <w:p>
       <w:pPr>
-        <w:pStyle w:val="ListBullet"/>
+        <w:pStyle w:val="ListNumber"/>
       </w:pPr>
       <w:r>
         <w:rPr>
           <w:sz w:val="22"/>
         </w:rPr>
-        <w:t>M7.5:** Total dry aggregates max 625 kg per 50 kg cement; Max 45 L water per 50 kg cement.</w:t>
+        <w:t>The manufacturer/producer/contractor shall consider the moisture content in aggregates (§7).</w:t>
       </w:r>
     </w:p>
     <w:p>
       <w:pPr>
-        <w:pStyle w:val="ListBullet"/>
+        <w:pStyle w:val="ListNumber"/>
       </w:pPr>
       <w:r>
         <w:rPr>
           <w:sz w:val="22"/>
         </w:rPr>
-        <w:t>M10:** Total dry aggregates max 480 kg per 50 kg cement; Max 34 L water per 50 kg cement.</w:t>
+        <w:t>The mix shall be designed to restrict the maximum free water-cement ratio to less than 0.5 (§7).</w:t>
       </w:r>
     </w:p>
     <w:p>
       <w:pPr>
-        <w:pStyle w:val="ListBullet"/>
+        <w:pStyle w:val="ListNumber"/>
       </w:pPr>
       <w:r>
         <w:rPr>
           <w:sz w:val="22"/>
         </w:rPr>
-        <w:t>M15:** Total dry aggregates max 330 kg per 50 kg cement; Max 32 L water per 50 kg cement.</w:t>
-      </w:r>
-    </w:p>
-    <w:p>
-      <w:pPr>
-        <w:pStyle w:val="ListBullet"/>
-      </w:pPr>
-      <w:r>
-        <w:rPr>
-          <w:sz w:val="22"/>
-        </w:rPr>
-        <w:t>M20:** Total dry aggregates max 250 kg per 50 kg cement; Max 30 L water per 50 kg cement.</w:t>
+        <w:t>Ready-mixed concrete supplied shall generally comply with IS 456 and meet agreed quality and quantity requirements (§5.9.2.1). Invoicing is in cubic metres of compacted fresh concrete (§5.9.2.1).</w:t>
       </w:r>
     </w:p>
     <w:p>
@@ -387,7 +387,7 @@
         <w:rPr>
           <w:sz w:val="22"/>
         </w:rPr>
-        <w:t>**Equipment:** Concrete shall be mixed in mechanical batch type concrete mixers conforming to IS 1791, having two blades and fitted with a power loader (lifting hopper type). Half bag mixers and mixers without lifting hoppers shall not be used (per §4.2.5).</w:t>
+        <w:t>Concrete shall be mixed in mechanical batch type concrete mixers conforming to IS 1791, with two blades and power loader. Half bag mixers and mixers without lifting hoppers are prohibited (§6).</w:t>
       </w:r>
     </w:p>
     <w:p>
@@ -398,7 +398,7 @@
         <w:rPr>
           <w:sz w:val="22"/>
         </w:rPr>
-        <w:t>**Hand Mixing:** Hand mixing may be done only in exceptional circumstances (e.g., mechanical breakdown, remote areas, power breakdown, very small quantity) with specific prior written permission from the Engineer-in-Charge and subject to adding 10% extra cement. It shall be carried out on a watertight platform until uniform in colour and consistency (per §4.2.5).</w:t>
+        <w:t>Prior to mixing, any water retained in the mixing drum for washing purposes shall be completely discharged (§4(i)).</w:t>
       </w:r>
     </w:p>
     <w:p>
@@ -409,7 +409,7 @@
         <w:rPr>
           <w:sz w:val="22"/>
         </w:rPr>
-        <w:t>**Aggregate Preparation:** Brick aggregate shall be well soaked with water for a minimum period of two hours. Stone aggregate or gravel shall be washed to remove dirt, dust, and foreign materials (per §4.2.5).</w:t>
+        <w:t>Brick aggregate shall be well soaked with water for a minimum of two hours, and stone aggregate or gravel shall be washed to remove dirt, dust, and foreign materials (§6).</w:t>
       </w:r>
     </w:p>
     <w:p>
@@ -420,7 +420,40 @@
         <w:rPr>
           <w:sz w:val="22"/>
         </w:rPr>
-        <w:t>**Mixing Time:** For guidance, mixing time may be 1.5 to 2 minutes; for hydrophobic cement, it may be 2.5 to 3 minutes (per §4.2.5).</w:t>
+        <w:t>Stationary or Central Mixers:</w:t>
+      </w:r>
+    </w:p>
+    <w:p>
+      <w:pPr>
+        <w:pStyle w:val="ListBullet"/>
+      </w:pPr>
+      <w:r>
+        <w:rPr>
+          <w:sz w:val="22"/>
+        </w:rPr>
+        <w:t>Mixers shall not be loaded in excess of the manufacturer’s rated capacity (§4(ii)).</w:t>
+      </w:r>
+    </w:p>
+    <w:p>
+      <w:pPr>
+        <w:pStyle w:val="ListBullet"/>
+      </w:pPr>
+      <w:r>
+        <w:rPr>
+          <w:sz w:val="22"/>
+        </w:rPr>
+        <w:t>Mixing time shall be measured from when all materials, including water, are in the drum, and shall not be less than the manufacturer’s recommendation (§4(ii)).</w:t>
+      </w:r>
+    </w:p>
+    <w:p>
+      <w:pPr>
+        <w:pStyle w:val="ListBullet"/>
+      </w:pPr>
+      <w:r>
+        <w:rPr>
+          <w:sz w:val="22"/>
+        </w:rPr>
+        <w:t>For continuous mixing plants, total mixing time must ensure required concrete uniformity (§4(ii)).</w:t>
       </w:r>
     </w:p>
     <w:p>
@@ -431,7 +464,106 @@
         <w:rPr>
           <w:sz w:val="22"/>
         </w:rPr>
-        <w:t>**Mixing Efficiency:** The mixer shall be tested per IS 4643 to ensure concrete uniformity. Percentage variation in quantity (mass in water) between the two halves of a batch and the average of the two halves shall not exceed: Cement 8%, Fine aggregate 6%, Coarse aggregate 5% (per §4.2.5.2).</w:t>
+        <w:t>Truck Mixers:</w:t>
+      </w:r>
+    </w:p>
+    <w:p>
+      <w:pPr>
+        <w:pStyle w:val="ListBullet"/>
+      </w:pPr>
+      <w:r>
+        <w:rPr>
+          <w:sz w:val="22"/>
+        </w:rPr>
+        <w:t>Mixing commences when all materials, including water, are in the rotating drum (§4(iii)).</w:t>
+      </w:r>
+    </w:p>
+    <w:p>
+      <w:pPr>
+        <w:pStyle w:val="ListBullet"/>
+      </w:pPr>
+      <w:r>
+        <w:rPr>
+          <w:sz w:val="22"/>
+        </w:rPr>
+        <w:t>Truck mixers shall not be loaded beyond the manufacturer’s rated capacity (§4(iii)).</w:t>
+      </w:r>
+    </w:p>
+    <w:p>
+      <w:pPr>
+        <w:pStyle w:val="ListBullet"/>
+      </w:pPr>
+      <w:r>
+        <w:rPr>
+          <w:sz w:val="22"/>
+        </w:rPr>
+        <w:t>Mixing shall continue for not less than 60 revolutions at a rate of not less than 7 revolutions/min, unless other data establishes different periods and speeds (§4(iii)).</w:t>
+      </w:r>
+    </w:p>
+    <w:p>
+      <w:pPr>
+        <w:pStyle w:val="ListBullet"/>
+      </w:pPr>
+      <w:r>
+        <w:rPr>
+          <w:sz w:val="22"/>
+        </w:rPr>
+        <w:t>Completely truck mixed concrete shall be visually inspected for uniformity before leaving the plant (§4(iii)).</w:t>
+      </w:r>
+    </w:p>
+    <w:p>
+      <w:pPr>
+        <w:pStyle w:val="ListBullet"/>
+      </w:pPr>
+      <w:r>
+        <w:rPr>
+          <w:sz w:val="22"/>
+        </w:rPr>
+        <w:t>If concrete is pre-mixed and transported by truck mixer/agitator, it shall be agitated during transit and remixed at site for at least 2 minutes to ensure uniformity (§4(iii)).</w:t>
+      </w:r>
+    </w:p>
+    <w:p>
+      <w:pPr>
+        <w:pStyle w:val="ListBullet"/>
+      </w:pPr>
+      <w:r>
+        <w:rPr>
+          <w:sz w:val="22"/>
+        </w:rPr>
+        <w:t>If water is added in a truck mixer and accounted for in the mix, the water meter must be operational and calibrated. If no meter, water must be measured in a suitable container (§4(iii)).</w:t>
+      </w:r>
+    </w:p>
+    <w:p>
+      <w:pPr>
+        <w:pStyle w:val="ListNumber"/>
+      </w:pPr>
+      <w:r>
+        <w:rPr>
+          <w:sz w:val="22"/>
+        </w:rPr>
+        <w:t>Mixer Condition: Stationary and truck mixers shall be maintained in an efficient and clean condition, free of hardened concrete or cement build-up (§4(iv)).</w:t>
+      </w:r>
+    </w:p>
+    <w:p>
+      <w:pPr>
+        <w:pStyle w:val="ListNumber"/>
+      </w:pPr>
+      <w:r>
+        <w:rPr>
+          <w:sz w:val="22"/>
+        </w:rPr>
+        <w:t>Mixing Efficiency: Mixer shall be tested per IS 4643. Percentage variation between quantities (mass in water) of cement, fine aggregate, and coarse aggregate in two halves of a batch and average of the two halves shall not exceed: Cement 8%, Fine aggregate 6%, Coarse aggregate 5% (§3).</w:t>
+      </w:r>
+    </w:p>
+    <w:p>
+      <w:pPr>
+        <w:pStyle w:val="ListNumber"/>
+      </w:pPr>
+      <w:r>
+        <w:rPr>
+          <w:sz w:val="22"/>
+        </w:rPr>
+        <w:t>Hand Mixing: May be permitted in exceptional circumstances (e.g., mechanical breakdown, remote areas, small quantity) with specific prior written permission from the Engineer-in-Charge, subject to adding 10% extra cement. Hand mixing shall be on a watertight platform until uniform in color and consistency. Guidance mixing time is 1.5 to 2 minutes; 2.5 to 3 minutes for hydrophobic cement (§6).</w:t>
       </w:r>
     </w:p>
     <w:p>
@@ -450,7 +582,7 @@
         <w:rPr>
           <w:sz w:val="22"/>
         </w:rPr>
-        <w:t>Concrete shall be compacted into a dense mass immediately after placing (per §5.4.3.1).</w:t>
+        <w:t>Ready-mixed concrete shall be transported from the mixer to the point of placing as rapidly as practicable by methods that maintain workability and prevent segregation, loss of constituents, or ingress of foreign matter/water (§5.9.2.2).</w:t>
       </w:r>
     </w:p>
     <w:p>
@@ -461,7 +593,40 @@
         <w:rPr>
           <w:sz w:val="22"/>
         </w:rPr>
-        <w:t>Specific procedures for transportation and placing are not explicitly stated in the specification.</w:t>
+        <w:t>Concrete shall be placed as soon as possible after delivery, as close as practicable to its final position to avoid re-handling or horizontal movement by vibration (§5.9.2.2).</w:t>
+      </w:r>
+    </w:p>
+    <w:p>
+      <w:pPr>
+        <w:pStyle w:val="ListNumber"/>
+      </w:pPr>
+      <w:r>
+        <w:rPr>
+          <w:sz w:val="22"/>
+        </w:rPr>
+        <w:t>The purchaser should plan to discharge a full load of concrete within 30 minutes of arrival on site (§5.9.2.2).</w:t>
+      </w:r>
+    </w:p>
+    <w:p>
+      <w:pPr>
+        <w:pStyle w:val="ListNumber"/>
+      </w:pPr>
+      <w:r>
+        <w:rPr>
+          <w:sz w:val="22"/>
+        </w:rPr>
+        <w:t>Transport shall be in a truck-mixer unless non-agitating vehicles are agreed upon by the purchaser. If non-agitating vehicles are used, concrete must be protected from gain or loss of water (§5.9.2.2).</w:t>
+      </w:r>
+    </w:p>
+    <w:p>
+      <w:pPr>
+        <w:pStyle w:val="ListNumber"/>
+      </w:pPr>
+      <w:r>
+        <w:rPr>
+          <w:sz w:val="22"/>
+        </w:rPr>
+        <w:t>Admixtures may be utilized by the producer to slow workability loss, but this does not negate the purchaser's responsibility for rapid placement (§5.9.2.2).</w:t>
       </w:r>
     </w:p>
     <w:p>
@@ -480,7 +645,7 @@
         <w:rPr>
           <w:sz w:val="22"/>
         </w:rPr>
-        <w:t>**Method:** Concrete shall be compacted into a dense mass immediately after placing by mechanical vibrators designed for continuous operations, complying with IS 2505, IS 2506, IS 2514, and IS 4656 (per §5.4.3.1).</w:t>
+        <w:t>Concrete shall be compacted into a dense mass immediately after placing using mechanical vibrators designed for continuous operation, complying with IS 2505, IS 2506, IS 2514, and IS 4656 (§9).</w:t>
       </w:r>
     </w:p>
     <w:p>
@@ -491,7 +656,7 @@
         <w:rPr>
           <w:sz w:val="22"/>
         </w:rPr>
-        <w:t>**Hand Compaction:** The Engineer-in-Charge may, at their discretion, permit hand compaction with tamping rods for certain items, ensuring concrete is thoroughly compacted and worked around reinforcement, embedded fixtures, and into form corners (per §5.4.3.1).</w:t>
+        <w:t>The Engineer-in-Charge may permit hand compaction for certain items, depending on thickness and feasibility. Hand compaction shall be done with tamping rods to thoroughly compact concrete around reinforcement, embedded fixtures, and into corners (§9).</w:t>
       </w:r>
     </w:p>
     <w:p>
@@ -502,7 +667,7 @@
         <w:rPr>
           <w:sz w:val="22"/>
         </w:rPr>
-        <w:t>**Layering:** Layers of concrete shall be placed such that the bottom layer does not finally set before the top layer is placed (per §5.4.3.1).</w:t>
+        <w:t>Layers of concrete shall be placed such that the bottom layer does not finally set before the top layer is placed (§9).</w:t>
       </w:r>
     </w:p>
     <w:p>
@@ -513,7 +678,18 @@
         <w:rPr>
           <w:sz w:val="22"/>
         </w:rPr>
-        <w:t>**Vibration:** Vibrators shall maintain adequate agitation for de-aeration and effective compaction, commensurate with the supply rate. Vibration shall continue throughout the placing period, with vibrators adjusted so the center of vibrations approximates the center of the mass being compacted (per §5.4.3.1).</w:t>
+        <w:t>Vibrators shall maintain the concrete under treatment in an adequate state of agitation to achieve de-aeration and effective compaction at a rate commensurate with concrete supply (§9).</w:t>
+      </w:r>
+    </w:p>
+    <w:p>
+      <w:pPr>
+        <w:pStyle w:val="ListNumber"/>
+      </w:pPr>
+      <w:r>
+        <w:rPr>
+          <w:sz w:val="22"/>
+        </w:rPr>
+        <w:t>Vibration shall continue throughout concrete placing, with vibrators adjusted so the center of vibrations approximates the center of the mass being compacted (§9).</w:t>
       </w:r>
     </w:p>
     <w:p>
@@ -548,7 +724,7 @@
         <w:rPr>
           <w:sz w:val="22"/>
         </w:rPr>
-        <w:t>**Purpose:** Curing is the process of preventing loss of moisture from the concrete (per §4.2.10).</w:t>
+        <w:t>Curing is the process of preventing moisture loss from the concrete (§10).</w:t>
       </w:r>
     </w:p>
     <w:p>
@@ -559,40 +735,7 @@
         <w:rPr>
           <w:sz w:val="22"/>
         </w:rPr>
-        <w:t>**Initial Protection:** After concrete has begun to harden (approximately 1 to 2 hours after laying), it shall be protected from quick drying by covering with moist gunny bags, sand, canvass Hessian, or other Engineer-in-Charge approved material (per §5.4.6).</w:t>
-      </w:r>
-    </w:p>
-    <w:p>
-      <w:pPr>
-        <w:pStyle w:val="ListNumber"/>
-      </w:pPr>
-      <w:r>
-        <w:rPr>
-          <w:sz w:val="22"/>
-        </w:rPr>
-        <w:t>**Ponding:** After 24 hours of laying, the surface shall be cured by ponding with water for a minimum period of 7 days from the date of placing for Ordinary Portland Cement (OPC), and at least 10 days where mineral admixtures or blended cements are used (per §5.4.6).</w:t>
-      </w:r>
-    </w:p>
-    <w:p>
-      <w:pPr>
-        <w:pStyle w:val="ListNumber"/>
-      </w:pPr>
-      <w:r>
-        <w:rPr>
-          <w:sz w:val="22"/>
-        </w:rPr>
-        <w:t>**Weather Conditions:** The curing period shall not be less than 10 days for concrete exposed to dry and hot weather conditions (per §5.4.6).</w:t>
-      </w:r>
-    </w:p>
-    <w:p>
-      <w:pPr>
-        <w:pStyle w:val="ListNumber"/>
-      </w:pPr>
-      <w:r>
-        <w:rPr>
-          <w:sz w:val="22"/>
-        </w:rPr>
-        <w:t>**Membrane Curing:** Approved curing compounds may be used in lieu of moist curing with the Engineer-in-Charge's permission. Such compounds shall be applied to all exposed surfaces as soon as possible after the concrete has set. Impermeable membranes, such as polythene sheets, may also be used (per §4.2.10.2).</w:t>
+        <w:t>Specific methods and duration for curing are not explicitly stated in the specification (§10).</w:t>
       </w:r>
     </w:p>
     <w:p/>
@@ -612,7 +755,7 @@
         <w:rPr>
           <w:sz w:val="22"/>
         </w:rPr>
-        <w:t>Props**: Provided for multi-stage centering where the height exceeds 3.50 metres (per §5.2.3.4). They also support beam heads (per §5.2.3.3).</w:t>
+        <w:t>Stationary/Central Mixers:** For mixing concrete batches to specified uniformity, adhering to manufacturer's capacity and mixing time (per §5.9.6.4).</w:t>
       </w:r>
     </w:p>
     <w:p>
@@ -623,7 +766,7 @@
         <w:rPr>
           <w:sz w:val="22"/>
         </w:rPr>
-        <w:t>Steel shuttering**: Used for concreting, requiring sufficient stiffness, proper repair, and cleaning (per §5.2.3.3).</w:t>
+        <w:t>Truck Mixers/Agitators:** For partial or complete mixing of concrete, or for transporting and agitating pre-mixed concrete during transit (per §5.9.6.4, §5.9.2.3).</w:t>
       </w:r>
     </w:p>
     <w:p>
@@ -634,7 +777,7 @@
         <w:rPr>
           <w:sz w:val="22"/>
         </w:rPr>
-        <w:t>12 mm thick water proofing ply**: May be used as shuttering for unavoidable portions and very small works where steel shuttering is not feasible (per §5.2.3.3).</w:t>
+        <w:t>Mechanical Batch Type Concrete Mixers:** Conforming to IS 1791, with two blades and power loader, for machine mixing (per §4.2.5, §4.2.5.3).</w:t>
       </w:r>
     </w:p>
     <w:p>
@@ -645,7 +788,7 @@
         <w:rPr>
           <w:sz w:val="22"/>
         </w:rPr>
-        <w:t>Rubberized lining of material**: Provided in shuttering joints, if required and approved by the Engineer-in-Charge, to prevent slurry leakage (per §5.2.3.3).</w:t>
+        <w:t>Truck Mixer Water Meter:** For measuring water added to concrete in a truck mixer, requiring calibration (per §5.9.6.4).</w:t>
       </w:r>
     </w:p>
     <w:p>
@@ -656,7 +799,7 @@
         <w:rPr>
           <w:sz w:val="22"/>
         </w:rPr>
-        <w:t>Runner Joists (RSJ, MS Channel or other suitable sections)**: Used as runners in shuttering (per §5.2.3.3).</w:t>
+        <w:t>Suitable Container:** For measuring water when a truck mixer water meter is unavailable (per §5.9.6.4).</w:t>
       </w:r>
     </w:p>
     <w:p>
@@ -667,7 +810,7 @@
         <w:rPr>
           <w:sz w:val="22"/>
         </w:rPr>
-        <w:t>Beam head**: An adopter that fits on prop head plates to provide wider support under beam bottoms (per §5.2.3.3).</w:t>
+        <w:t>Mechanical Vibrators (including Internal/Needle, External, and Vibrating Tables):** For compacting concrete into a dense mass, conforming to IS 2505, IS 2506, IS 2514, and IS 4656 (per §5.4.3.1, §5.4.3.2, §4.2.7).</w:t>
       </w:r>
     </w:p>
     <w:p>
@@ -678,7 +821,7 @@
         <w:rPr>
           <w:sz w:val="22"/>
         </w:rPr>
-        <w:t>Stationary/Central Mixers**: Used for mixing concrete, not exceeding manufacturer's rated capacity. Mixing time shall be as recommended by the manufacturer (per §5.9.6.4).</w:t>
+        <w:t>Tamping Rods:** For hand compaction of concrete, especially around reinforcement and into corners (per §5.4.3.1).</w:t>
       </w:r>
     </w:p>
     <w:p>
@@ -689,7 +832,7 @@
         <w:rPr>
           <w:sz w:val="22"/>
         </w:rPr>
-        <w:t>Continuous mixing plant**: Used to ensure the concrete is of required uniformity (per §5.9.6.4).</w:t>
+        <w:t>Wooden Trowel:** For finishing the top surface of compacted concrete smoothly before setting (per §4.2.7).</w:t>
       </w:r>
     </w:p>
     <w:p>
@@ -700,7 +843,7 @@
         <w:rPr>
           <w:sz w:val="22"/>
         </w:rPr>
-        <w:t>Truck Mixers / Agitators**: Used for partial or complete mixing of concrete and for transportation, not exceeding manufacturer’s rated capacity (per §5.9.6.4).</w:t>
+        <w:t>Formwork (Centring &amp; Shuttering):** Designed to support fresh concrete, reinforcement, and live loads during construction (per §5.2, §5.2.3.4).</w:t>
       </w:r>
     </w:p>
     <w:p>
@@ -711,7 +854,7 @@
         <w:rPr>
           <w:sz w:val="22"/>
         </w:rPr>
-        <w:t>Truck mixer water meter**: Used to measure water added to concrete in the truck mixer, must be operational and calibrated (per §5.9.6.4).</w:t>
+        <w:t>Props:** To support formwork, particularly for multi-stage arrangements exceeding 3.50 meters height (per §5.2.3.4).</w:t>
       </w:r>
     </w:p>
     <w:p>
@@ -722,18 +865,7 @@
         <w:rPr>
           <w:sz w:val="22"/>
         </w:rPr>
-        <w:t>Suitable container**: Used for measuring water if a truck mixer water meter is not available (per §5.9.6.4).</w:t>
-      </w:r>
-    </w:p>
-    <w:p>
-      <w:pPr>
-        <w:pStyle w:val="ListBullet"/>
-      </w:pPr>
-      <w:r>
-        <w:rPr>
-          <w:sz w:val="22"/>
-        </w:rPr>
-        <w:t>Squeeze pressure pumps**: Consist of a receiving hopper with re-mixing blades, a flexible hose, a metal drum maintained under vacuum, and hydraulically operated metal rollers, used for forcing concrete into pipelines (per §5.10.2.2).</w:t>
+        <w:t>Squeeze Pressure Pumps:** For pumping concrete, incorporating a hopper, re-mixing blades, flexible hose, and rollers within a vacuum drum (per §5.10.2.2).</w:t>
       </w:r>
     </w:p>
     <w:p/>
@@ -746,19 +878,14 @@
       </w:r>
     </w:p>
     <w:p>
+      <w:pPr>
+        <w:pStyle w:val="ListBullet"/>
+      </w:pPr>
       <w:r>
         <w:rPr>
           <w:sz w:val="22"/>
         </w:rPr>
-        <w:t>The only explicitly mentioned role is the **Producer**, who shall have a procedure in place to enable the diagnosis and correction of faults identified from complaints (per §5.9.7.6).</w:t>
-      </w:r>
-    </w:p>
-    <w:p>
-      <w:r>
-        <w:rPr>
-          <w:sz w:val="22"/>
-        </w:rPr>
-        <w:t>Roles implied by activities, but not explicitly named or assigned specific personnel responsibilities within the provided excerpts, include:</w:t>
+        <w:t>Engineer-in-Charge**: Finalizes the frequency and number of tests for freshly mixed concrete in consultation with the manufacturer of concrete (per §5.11.4.4). May, at their discretion, require further tests on fresh concrete (per §5.11.4.4).</w:t>
       </w:r>
     </w:p>
     <w:p>
@@ -769,7 +896,7 @@
         <w:rPr>
           <w:sz w:val="22"/>
         </w:rPr>
-        <w:t>Personnel responsible for Testing of Concrete (per §4.2.11, §5.4.9).</w:t>
+        <w:t>Manufacturer of concrete**: Finalizes the frequency and number of tests for freshly mixed concrete in consultation with the Engineer-in-Charge (per §5.11.4.4). Shall comply with all requirements for further tests specified by the Engineer-in-Charge (per §5.11.4.4).</w:t>
       </w:r>
     </w:p>
     <w:p>
@@ -780,7 +907,7 @@
         <w:rPr>
           <w:sz w:val="22"/>
         </w:rPr>
-        <w:t>Personnel responsible for Sampling and Testing of Ready-Mixed Concrete (per §5.9.3).</w:t>
+        <w:t>Batch plant laboratory**: Conducts tests for every type of freshly mixed concrete, for each batch, to determine weight per cubic metre, cement factor, and air content (per §5.11.4.4).</w:t>
       </w:r>
     </w:p>
     <w:p>
@@ -791,7 +918,7 @@
         <w:rPr>
           <w:sz w:val="22"/>
         </w:rPr>
-        <w:t>Personnel responsible for Quality Control, encompassing forward, immediate, and retrospective control (per §5.9.7).</w:t>
+        <w:t>Placement contractor**: Shall comply with all requirements for further tests on fresh concrete as specified by the Engineer-in-Charge (per §5.11.4.4).</w:t>
       </w:r>
     </w:p>
     <w:p>
@@ -802,7 +929,7 @@
         <w:rPr>
           <w:sz w:val="22"/>
         </w:rPr>
-        <w:t>Personnel involved in the diagnosis and correction of faults as part of the complaint procedure (per §5.9.7.6).</w:t>
+        <w:t>Producer**: Shall have a procedure in place to enable the diagnosis and correction of faults identified from complaints (per §5.9.7.6).</w:t>
       </w:r>
     </w:p>
     <w:p/>
@@ -819,7 +946,7 @@
         <w:rPr>
           <w:sz w:val="22"/>
         </w:rPr>
-        <w:t>Quality control mandates cube tests for concrete compressive strength per IS 456 and IS 516 (§5.4.9.1, §5.11.5(i)). Fresh concrete samples are taken from the central batch plant (guideline tests) and placement location (field tests), with field test results serving as the sole criterion for strength (§5.11.5(a), (b)). For truck/shrink mix, guideline samples are collected at discharge, omitting the first and last 15% of the load (§5.11.5(c)).</w:t>
+        <w:t>Quality control for hardened concrete follows IS 456 and IS 516 (§5.11.5(i)). Samples for cube crushing strength are collected from the central batch plant (guideline tests) and placement locations (field test specimens, serving as criterion for acceptance) (§5.11.5(i)(a), (b)). For truck mix, samples exclude the first and last 15% of the load (§5.11.5(i)(c)). Sampling frequency for 7-day and 28-day crushing strength tests, requiring a minimum of 3 cubes per sample, is as per Table 5.8 (not explicitly stated in the specification) (§5.11.5(i)(d), (f)). Preliminary 7-day and 28-day tests, six specimens each, are conducted in the laboratory for design mix finalization (§5.11.5(i)(g)).</w:t>
       </w:r>
     </w:p>
     <w:p>
@@ -827,7 +954,7 @@
         <w:rPr>
           <w:sz w:val="22"/>
         </w:rPr>
-        <w:t>Sampling frequency for 28-day crushing strength tests, for both field and guideline specimens, is as given in Table 5.8. Each sample must yield a minimum of 3 cubes per IS 516 (§5.11.5(d)). Identical frequencies apply to 7-day early strength tests (§5.11.5(f)). Preliminary design mix tests mandate six 7-day and six 28-day specimens (§5.11.5(g)).</w:t>
+        <w:t>For 7-day tests, a sample's average strength is accepted if individual specimen variation is within ±15% and the max-min difference within 30% of the average; otherwise, 28-day tests are mandated (§5.4.10.3). Concrete is accepted if the actual average strength is equal to or higher than specified strength up to +15% (§5.4.10.3); 7-day results are for projection only, not specification conformance (§5.11.5(i)(f)).</w:t>
       </w:r>
     </w:p>
     <w:p>
@@ -835,7 +962,7 @@
         <w:rPr>
           <w:sz w:val="22"/>
         </w:rPr>
-        <w:t>Acceptance for 28-day field specimen crushing strength requires results not less than values given in Table 5.6 (§5.11.5(e)). 7-day strengths are for projection only and do not confirm specification compliance (§5.11.5(f)).</w:t>
+        <w:t>For 28-day tests, a sample's average is accepted if individual cube strength is between 70% and 130% of the specified strength (§5.4.10.4(a)). Concrete is accepted at full rates if the actual average strength is equal to or higher than specified up to 30% (§5.4.10.4(c)). Reduced rates may apply if strength is below specified but ≥ 70% (Engineer-in-Charge (E-i-C) discretion) (§5.4.10.4(d)). Strength &lt; 70% results in rejection and contractor-borne remedial work (§5.4.10.4(e)). Field specimen results must also meet Table 5.6 values (not explicitly stated in the specification) (§5.11.5(i)(e)).</w:t>
       </w:r>
     </w:p>
     <w:p>
@@ -843,15 +970,7 @@
         <w:rPr>
           <w:sz w:val="22"/>
         </w:rPr>
-        <w:t>Should 28-day values fall short, or concrete placement be doubtful, the Engineer-in-Charge may order non-destructive tests (e.g., Rebound hammer, Core test, Load test) (§5.11.5(ii)(a)). Core tests follow IS 516, with samples per IS:1199 from Engineer-in-Charge identified locations (§5.11.5(ii)(c)).</w:t>
-      </w:r>
-    </w:p>
-    <w:p>
-      <w:r>
-        <w:rPr>
-          <w:sz w:val="22"/>
-        </w:rPr>
-        <w:t>All tests are to be conducted by qualified contractor/manufacturer technicians, witnessed by the Engineer-in-Charge’s authorized representative, with reports jointly signed (§5.11.5(ii)(f)). The contractor/manufacturer must establish a fully equipped and staffed field laboratory at their expense (§5.11.5(ii)(h)) and bear all testing costs (§5.11.5(ii)(e)). Specimens must be properly labeled with date, grade, exact placement location, and purchaser's order number (§5.11.5(i)).</w:t>
+        <w:t>The E-i-C may order non-destructive tests (NDT) such as Rebound hammer, Core test (per IS 516, IS:1199), or Load test, if crushing values are deficient or placement is doubtful (§5.11.5(ii)(a), (c), (d)). All field laboratory tests require the presence of the E-i-C's authorized representative and joint signing of reports (§5.11.5(ii)(f)). The contractor bears all testing costs and must establish and staff a field laboratory (§5.11.5(ii)(e), (h)).</w:t>
       </w:r>
     </w:p>
     <w:p/>
@@ -868,7 +987,23 @@
         <w:rPr>
           <w:sz w:val="22"/>
         </w:rPr>
-        <w:t>Health, Safety, and Environmental (HSE) measures are not explicitly stated in the provided specification excerpts. The documents classify environmental exposure conditions for the concrete's working life (per §4.2.14.1.1) and specify nominal concrete cover based on these exposure levels (per §5.3.3.5 and §5.3.5), but do not detail any procedures, requirements, or precautions for worker safety, health protection, or environmental management during RCC works.</w:t>
+        <w:t>The specification includes one measure related to environmental protection during concrete works:</w:t>
+      </w:r>
+    </w:p>
+    <w:p>
+      <w:r>
+        <w:rPr>
+          <w:sz w:val="22"/>
+        </w:rPr>
+        <w:t>Freshly laid concrete shall be protected from rain by suitable covering (per §4.2.10.3).</w:t>
+      </w:r>
+    </w:p>
+    <w:p>
+      <w:r>
+        <w:rPr>
+          <w:sz w:val="22"/>
+        </w:rPr>
+        <w:t>Other general Health and Safety measures for personnel, or broader site environmental management protocols (e.g., pollution control, waste management), are not explicitly stated in the provided specification excerpts. The classification of environmental exposure conditions (per §4.2.14.1.1) and corresponding concrete cover requirements (per §5.3.3.5, §5.3.5) relate to the design for durability, not operational HSE measures.</w:t>
       </w:r>
     </w:p>
     <w:p/>
@@ -885,7 +1020,7 @@
         <w:rPr>
           <w:sz w:val="22"/>
         </w:rPr>
-        <w:t>Materials and works shall conform to the latest edition of reference specifications, applicable codes, and requirements of local authorities (per §5.12.1.2). Admixtures must be tested per IS 9103 and approved by the Engineer-in-Charge (per §4.1.2.9); for M30 &amp; above, PCE based and Viscosity Modifiers are specified or as per design mix (per §5.8.6.2).</w:t>
+        <w:t>Concreting shall not be undertaken when the temperature falls below 4.5°C (§5.4.2.5, §4.2.9.1). During cold weather, concrete placed must be protected against frost by suitable covering (§5.4.2.5). Procedures for hot and cold weather concreting shall follow IS 7861 (Part–I)-1975 and IS 7861 (Part II)-1981 respectively (§4.2.9.1). During hot weather, the temperature of wet concrete shall not exceed 38°C (§4.2.9.1, §5.4.2.6). No concrete shall be laid within half an hour of the day's closing time, unless approved by the Engineer-in-Charge (§5.4.2.6).</w:t>
       </w:r>
     </w:p>
     <w:p>
@@ -893,15 +1028,7 @@
         <w:rPr>
           <w:sz w:val="22"/>
         </w:rPr>
-        <w:t>Concreting in extreme weather shall follow IS 7861 (Part–I)-1975 (hot) and IS 7861 (Part II)-1981 (cold) (per §4.2.9.1). Concreting is prohibited below 4.5ºC and placed concrete must be protected against frost (per §4.2.9.1, §5.4.2.5). Wet concrete temperature shall not exceed 38ºC during hot weather (per §4.2.9.1, §5.4.2.6). No concrete shall be laid within half an hour of closing time, unless permitted by the Engineer-in-Charge (per §5.4.2.6).</w:t>
-      </w:r>
-    </w:p>
-    <w:p>
-      <w:r>
-        <w:rPr>
-          <w:sz w:val="22"/>
-        </w:rPr>
-        <w:t>Concrete is liable to be rejected if porous, honey-combed, placing interrupted without a proper joint, or reinforcement/construction tolerances are not met (per §5.8.3.6). Hardened concrete may be accepted after suitable remedial measures to the Engineer-in-Charge's satisfaction (per §5.8.3.6). Frost-damaged concrete shall be removed and redone (per §5.4.2.5). Non-compliant concrete requires investigation of structural adequacy and consequential action (per §5.8.3.4).</w:t>
+        <w:t>Concrete is liable to be rejected if porous or honey-combed, if placing was interrupted without a proper construction joint, if reinforcement is displaced beyond tolerances, or if construction tolerances are not met (§5.8.3.6). Concrete damaged by frost shall be removed and redone (§5.4.2.5). Hardened concrete may be accepted following suitable remedial measures to the Engineer-in-Charge's satisfaction (§5.8.3.6). If concrete is deemed non-compliant per §5.8.3, the structural adequacy of affected parts shall be investigated, and consequential action taken (§5.8.3.4). Material substitutions or proportion alterations are not permitted without additional tests demonstrating satisfactory quality and strength (§4.2.4.6). Admixtures require testing per IS 9103 and approval by the Engineer-in-Charge (§4.1.2.9).</w:t>
       </w:r>
     </w:p>
     <w:p/>

</xml_diff>